<commit_message>
Fold data-sources into agenda and refresh portable exports.
Omit slide 3 from deck navigation and Word export; surface scale, Play Store, and community stats on agenda slide 2. Rebuild zip and docx (32 slides).

Co-authored-by: Cursor <cursoragent@cursor.com>
</commit_message>
<xml_diff>
--- a/bharatpe-consumer/analyses/upi-retention-presentation/upi-retention-results.docx
+++ b/bharatpe-consumer/analyses/upi-retention-presentation/upi-retention-results.docx
@@ -64,7 +64,7 @@
           <w:b w:val="0"/>
           <w:i w:val="0"/>
         </w:rPr>
-        <w:t>Part A — Our data Definitions, VPA baseline, 17 BigQuery lenses, Play Store voice, lens index, UPI × BBPS · slides 3–28</w:t>
+        <w:t>Part A — Our data Definitions, VPA baseline, 17 BigQuery lenses, Play Store voice, lens index, UPI × BBPS · slides 4–28</w:t>
       </w:r>
     </w:p>
     <w:p>
@@ -115,132 +115,12 @@
       </w:r>
     </w:p>
     <w:p>
-      <w:pPr>
-        <w:pStyle w:val="ListBullet"/>
-      </w:pPr>
-      <w:r>
-        <w:t>Data &amp; definitions — BigQuery upi tables, cohort rules, ~720k payout pool (3)</w:t>
-      </w:r>
-    </w:p>
-    <w:p>
-      <w:pPr>
-        <w:pStyle w:val="ListBullet"/>
-      </w:pPr>
-      <w:r>
-        <w:t>Baseline retention — VPA created month, M+1–M+6 (4)</w:t>
-      </w:r>
-    </w:p>
-    <w:p>
-      <w:pPr>
-        <w:pStyle w:val="ListBullet"/>
-      </w:pPr>
-      <w:r>
-        <w:t>Lens intro — 16 behavioural cuts, first-30d after first payout SUCCESS (5)</w:t>
-      </w:r>
-    </w:p>
-    <w:p>
-      <w:pPr>
-        <w:pStyle w:val="ListBullet"/>
-      </w:pPr>
-      <w:r>
-        <w:t>BigQuery lenses — 5.1–5.17 (a–q) payout retention cuts (6–22) · SQL { } Source</w:t>
-      </w:r>
-    </w:p>
-    <w:p>
-      <w:pPr>
-        <w:pStyle w:val="ListBullet"/>
-      </w:pPr>
-      <w:r>
-        <w:t>Play Store 5.18 — six keyword sentiment themes (negative reviews) (23)</w:t>
-      </w:r>
-    </w:p>
-    <w:p>
-      <w:pPr>
-        <w:pStyle w:val="ListBullet"/>
-      </w:pPr>
-      <w:r>
-        <w:t>Play Store 5.19 — month-wise negative performance Jun 2025–May 2026 (24)</w:t>
-      </w:r>
-    </w:p>
-    <w:p>
-      <w:pPr>
-        <w:pStyle w:val="ListBullet"/>
-      </w:pPr>
-      <w:r>
-        <w:t>Play Store 5.20 — verbatim 1–3★ &amp; custom review corpus (25)</w:t>
-      </w:r>
-    </w:p>
-    <w:p>
-      <w:pPr>
-        <w:pStyle w:val="ListBullet"/>
-      </w:pPr>
-      <w:r>
-        <w:t>Lens index — jump to any lens or Play Store slide (26)</w:t>
-      </w:r>
-    </w:p>
-    <w:p>
-      <w:pPr>
-        <w:pStyle w:val="ListBullet"/>
-      </w:pPr>
-      <w:r>
-        <w:t>Story bridge — segmentation → BBPS ecosystem (27)</w:t>
-      </w:r>
-    </w:p>
-    <w:p>
-      <w:pPr>
-        <w:pStyle w:val="ListBullet"/>
-      </w:pPr>
-      <w:r>
-        <w:t>UPI × BBPS — attach, retention lift, NotebookLM + calling links (28)</w:t>
-      </w:r>
-    </w:p>
-    <w:p>
-      <w:pPr>
-        <w:pStyle w:val="ListBullet"/>
-      </w:pPr>
-      <w:r>
-        <w:t>Competitor landscape — intro; incumbents (Paytm, PhonePe, GPay…); challengers (CRED, Navi, Super.money) (29–31)</w:t>
-      </w:r>
-    </w:p>
-    <w:p>
-      <w:pPr>
-        <w:pStyle w:val="ListBullet"/>
-      </w:pPr>
-      <w:r>
-        <w:t>Emerging patterns — 50k+ Reddit / LinkedIn / X posts; six community patterns (32)</w:t>
-      </w:r>
-    </w:p>
-    <w:p>
-      <w:pPr>
-        <w:pStyle w:val="ListBullet"/>
-      </w:pPr>
-      <w:r>
-        <w:t>Story bridge — patterns → product actions (33)</w:t>
-      </w:r>
-    </w:p>
-    <w:p>
-      <w:pPr>
-        <w:pStyle w:val="ListBullet"/>
-      </w:pPr>
-      <w:r>
-        <w:t>What should be done? — funnel, Zillion, BBPS, speed, rewards, high-LTV cohorts (34)</w:t>
-      </w:r>
-    </w:p>
-    <w:p>
-      <w:pPr>
-        <w:pStyle w:val="ListBullet"/>
-      </w:pPr>
-      <w:r>
-        <w:t>Future (not today) — experiments, incentive budget, roadmap, governance (35)</w:t>
-      </w:r>
-    </w:p>
-    <w:p>
       <w:r>
         <w:rPr>
           <w:b w:val="0"/>
           <w:i w:val="0"/>
         </w:rPr>
-        <w:t>Part A — Our data Slides 3–28 Cohorts, 17 lenses, Play Store, BBPS</w:t>
+        <w:t>~3M UPI IDs · ~60M txns · ~₹10,000 Cr TPV</w:t>
       </w:r>
     </w:p>
     <w:p>
@@ -249,7 +129,138 @@
           <w:b w:val="0"/>
           <w:i w:val="0"/>
         </w:rPr>
-        <w:t>Part B — Market &amp; actions Slides 29–34 Competitors, patterns, 90-day bets</w:t>
+        <w:t>Play Store (5.18–5.20): 101k+ reviews since Jan 2025 · keyword themes · month scores Jun 2025–May 2026</w:t>
+      </w:r>
+    </w:p>
+    <w:p>
+      <w:r>
+        <w:rPr>
+          <w:b w:val="0"/>
+          <w:i w:val="0"/>
+        </w:rPr>
+        <w:t>Community sentiments from 50k+ conversation (POST, COMMENT) on reddit, linkedin and X</w:t>
+      </w:r>
+    </w:p>
+    <w:p>
+      <w:pPr>
+        <w:pStyle w:val="ListBullet"/>
+      </w:pPr>
+      <w:r>
+        <w:t>Baseline retention — VPA created month, M+1–M+6 · ~720k payout cohort Aug 2025–Jan 2026 (4)</w:t>
+      </w:r>
+    </w:p>
+    <w:p>
+      <w:pPr>
+        <w:pStyle w:val="ListBullet"/>
+      </w:pPr>
+      <w:r>
+        <w:t>Lens intro — 15 behavioural cuts, first-30d after first payout SUCCESS (5)</w:t>
+      </w:r>
+    </w:p>
+    <w:p>
+      <w:pPr>
+        <w:pStyle w:val="ListBullet"/>
+      </w:pPr>
+      <w:r>
+        <w:t>BigQuery lenses — 5.1–5.17 (a–q); 5.3 onboarding month omitted (6–7, 9–22) · SQL { } Source</w:t>
+      </w:r>
+    </w:p>
+    <w:p>
+      <w:pPr>
+        <w:pStyle w:val="ListBullet"/>
+      </w:pPr>
+      <w:r>
+        <w:t>Play Store 5.18 — six keyword sentiment themes (negative reviews) (23)</w:t>
+      </w:r>
+    </w:p>
+    <w:p>
+      <w:pPr>
+        <w:pStyle w:val="ListBullet"/>
+      </w:pPr>
+      <w:r>
+        <w:t>Play Store 5.19 — month-wise negative performance Jun 2025–May 2026 (24)</w:t>
+      </w:r>
+    </w:p>
+    <w:p>
+      <w:pPr>
+        <w:pStyle w:val="ListBullet"/>
+      </w:pPr>
+      <w:r>
+        <w:t>Play Store 5.20 — verbatim 1–3★ &amp; custom review corpus (25)</w:t>
+      </w:r>
+    </w:p>
+    <w:p>
+      <w:pPr>
+        <w:pStyle w:val="ListBullet"/>
+      </w:pPr>
+      <w:r>
+        <w:t>Lens index — jump to any lens or Play Store slide (26)</w:t>
+      </w:r>
+    </w:p>
+    <w:p>
+      <w:pPr>
+        <w:pStyle w:val="ListBullet"/>
+      </w:pPr>
+      <w:r>
+        <w:t>Story bridge — segmentation → BBPS ecosystem (27)</w:t>
+      </w:r>
+    </w:p>
+    <w:p>
+      <w:pPr>
+        <w:pStyle w:val="ListBullet"/>
+      </w:pPr>
+      <w:r>
+        <w:t>UPI × BBPS — attach, retention lift, NotebookLM + calling links (28)</w:t>
+      </w:r>
+    </w:p>
+    <w:p>
+      <w:pPr>
+        <w:pStyle w:val="ListBullet"/>
+      </w:pPr>
+      <w:r>
+        <w:t>Competitor landscape — intro; incumbents (Paytm, PhonePe, GPay…); challengers (CRED, Navi, Super.money) (29–31)</w:t>
+      </w:r>
+    </w:p>
+    <w:p>
+      <w:pPr>
+        <w:pStyle w:val="ListBullet"/>
+      </w:pPr>
+      <w:r>
+        <w:t>Emerging patterns — six community patterns (32)</w:t>
+      </w:r>
+    </w:p>
+    <w:p>
+      <w:pPr>
+        <w:pStyle w:val="ListBullet"/>
+      </w:pPr>
+      <w:r>
+        <w:t>Story bridge — patterns → strategic priorities (33)</w:t>
+      </w:r>
+    </w:p>
+    <w:p>
+      <w:pPr>
+        <w:pStyle w:val="ListBullet"/>
+      </w:pPr>
+      <w:r>
+        <w:t>What should be done? — broad strategic priorities (what, not how) (34)</w:t>
+      </w:r>
+    </w:p>
+    <w:p>
+      <w:r>
+        <w:rPr>
+          <w:b w:val="0"/>
+          <w:i w:val="0"/>
+        </w:rPr>
+        <w:t>Part A — Our data Slides 4–28 Cohorts, 17 lenses, Play Store, BBPS</w:t>
+      </w:r>
+    </w:p>
+    <w:p>
+      <w:r>
+        <w:rPr>
+          <w:b w:val="0"/>
+          <w:i w:val="0"/>
+        </w:rPr>
+        <w:t>Part B — Market &amp; close Slides 29–34 Competitors, patterns, strategic what</w:t>
       </w:r>
     </w:p>
     <w:p>
@@ -258,268 +269,7 @@
           <w:b w:val="0"/>
           <w:i/>
         </w:rPr>
-        <w:t>Key takeaway: 35 slides — Part A (3–28): warehouse diagnosis + Play Store voice (23–25) + BBPS; Part B (29–34): competitor &amp; community benchmark → concrete actions.</w:t>
-      </w:r>
-    </w:p>
-    <w:p>
-      <w:r>
-        <w:br w:type="page"/>
-      </w:r>
-    </w:p>
-    <w:p>
-      <w:pPr>
-        <w:pStyle w:val="Heading1"/>
-      </w:pPr>
-      <w:r>
-        <w:t>Slide 3</w:t>
-      </w:r>
-    </w:p>
-    <w:p>
-      <w:pPr>
-        <w:pStyle w:val="Heading2"/>
-      </w:pPr>
-      <w:r>
-        <w:t>Data sources &amp; definitions</w:t>
-      </w:r>
-    </w:p>
-    <w:p>
-      <w:pPr>
-        <w:pStyle w:val="Heading3"/>
-      </w:pPr>
-      <w:r>
-        <w:t>Warehouse (primary)</w:t>
-      </w:r>
-    </w:p>
-    <w:p>
-      <w:pPr>
-        <w:pStyle w:val="ListBullet"/>
-      </w:pPr>
-      <w:r>
-        <w:t>~3M UPI IDs · ~60M txns · ~₹10,000 Cr TPV</w:t>
-      </w:r>
-    </w:p>
-    <w:p>
-      <w:pPr>
-        <w:pStyle w:val="ListBullet"/>
-      </w:pPr>
-      <w:r>
-        <w:t>upi_transactions , users , user_bank_accounts</w:t>
-      </w:r>
-    </w:p>
-    <w:p>
-      <w:pPr>
-        <w:pStyle w:val="ListBullet"/>
-      </w:pPr>
-      <w:r>
-        <w:t>Installed apps (5.15): bharatpe_mongo_data.consumer_psp · appDetails</w:t>
-      </w:r>
-    </w:p>
-    <w:p>
-      <w:pPr>
-        <w:pStyle w:val="ListBullet"/>
-      </w:pPr>
-      <w:r>
-        <w:t>UPI Lite (5.17): upi_transactions.note · UPPER(note) LIKE '%UPI LITE%' in first 30d</w:t>
-      </w:r>
-    </w:p>
-    <w:p>
-      <w:pPr>
-        <w:pStyle w:val="ListBullet"/>
-      </w:pPr>
-      <w:r>
-        <w:t>Play Store (5.18–5.20): 101k+ reviews since Jan 2025 · keyword themes · month scores Jun 2025–May 2026</w:t>
-      </w:r>
-    </w:p>
-    <w:p>
-      <w:pPr>
-        <w:pStyle w:val="ListBullet"/>
-      </w:pPr>
-      <w:r>
-        <w:t>Payout: status=SUCCESS , subType ≠ RECEIVE_EXTERNAL</w:t>
-      </w:r>
-    </w:p>
-    <w:p>
-      <w:pPr>
-        <w:pStyle w:val="ListBullet"/>
-      </w:pPr>
-      <w:r>
-        <w:t>Pay-in: subType = RECEIVE_EXTERNAL</w:t>
-      </w:r>
-    </w:p>
-    <w:p>
-      <w:pPr>
-        <w:pStyle w:val="ListBullet"/>
-      </w:pPr>
-      <w:r>
-        <w:t>Pool (5.2–5.17) · Play Store (5.18–5.20): first payout SUCCESS Aug 2025–Jan 2026 (~719,936 users)</w:t>
-      </w:r>
-    </w:p>
-    <w:p>
-      <w:pPr>
-        <w:pStyle w:val="Heading3"/>
-      </w:pPr>
-      <w:r>
-        <w:t>Other inputs &amp; terms</w:t>
-      </w:r>
-    </w:p>
-    <w:p>
-      <w:pPr>
-        <w:pStyle w:val="ListBullet"/>
-      </w:pPr>
-      <w:r>
-        <w:t>User calling — qualitative friction</w:t>
-      </w:r>
-    </w:p>
-    <w:p>
-      <w:pPr>
-        <w:pStyle w:val="ListBullet"/>
-      </w:pPr>
-      <w:r>
-        <w:t>Competitor benchmarking — Slides 28–29 · Community / patterns — Slide 31</w:t>
-      </w:r>
-    </w:p>
-    <w:p>
-      <w:pPr>
-        <w:pStyle w:val="ListBullet"/>
-      </w:pPr>
-      <w:r>
-        <w:t>Mixpanel / BBPS — Slide 27 LINK</w:t>
-      </w:r>
-    </w:p>
-    <w:tbl>
-      <w:tblPr>
-        <w:tblStyle w:val="TableGrid"/>
-        <w:tblW w:type="auto" w:w="0"/>
-        <w:tblLook w:firstColumn="1" w:firstRow="1" w:lastColumn="0" w:lastRow="0" w:noHBand="0" w:noVBand="1" w:val="04A0"/>
-      </w:tblPr>
-      <w:tblGrid>
-        <w:gridCol w:w="5040"/>
-        <w:gridCol w:w="5040"/>
-      </w:tblGrid>
-      <w:tr>
-        <w:tc>
-          <w:tcPr>
-            <w:tcW w:type="dxa" w:w="5040"/>
-          </w:tcPr>
-          <w:p>
-            <w:r>
-              <w:rPr>
-                <w:b/>
-              </w:rPr>
-              <w:t>Term</w:t>
-            </w:r>
-          </w:p>
-        </w:tc>
-        <w:tc>
-          <w:tcPr>
-            <w:tcW w:type="dxa" w:w="5040"/>
-          </w:tcPr>
-          <w:p>
-            <w:r>
-              <w:rPr>
-                <w:b/>
-              </w:rPr>
-              <w:t>Rule</w:t>
-            </w:r>
-          </w:p>
-        </w:tc>
-      </w:tr>
-      <w:tr>
-        <w:tc>
-          <w:tcPr>
-            <w:tcW w:type="dxa" w:w="5040"/>
-          </w:tcPr>
-          <w:p>
-            <w:r>
-              <w:t>M+k</w:t>
-            </w:r>
-          </w:p>
-        </w:tc>
-        <w:tc>
-          <w:tcPr>
-            <w:tcW w:type="dxa" w:w="5040"/>
-          </w:tcPr>
-          <w:p>
-            <w:r>
-              <w:t>≥1 payout SUCCESS in cohort_month + k</w:t>
-            </w:r>
-          </w:p>
-        </w:tc>
-      </w:tr>
-      <w:tr>
-        <w:tc>
-          <w:tcPr>
-            <w:tcW w:type="dxa" w:w="5040"/>
-          </w:tcPr>
-          <w:p>
-            <w:r>
-              <w:t>First 30d</w:t>
-            </w:r>
-          </w:p>
-        </w:tc>
-        <w:tc>
-          <w:tcPr>
-            <w:tcW w:type="dxa" w:w="5040"/>
-          </w:tcPr>
-          <w:p>
-            <w:r>
-              <w:t>Day 0 = first payout SUCCESS date</w:t>
-            </w:r>
-          </w:p>
-        </w:tc>
-      </w:tr>
-      <w:tr>
-        <w:tc>
-          <w:tcPr>
-            <w:tcW w:type="dxa" w:w="5040"/>
-          </w:tcPr>
-          <w:p>
-            <w:r>
-              <w:t>Retention %</w:t>
-            </w:r>
-          </w:p>
-        </w:tc>
-        <w:tc>
-          <w:tcPr>
-            <w:tcW w:type="dxa" w:w="5040"/>
-          </w:tcPr>
-          <w:p>
-            <w:r>
-              <w:t>Active users ÷ cohort size × 100</w:t>
-            </w:r>
-          </w:p>
-        </w:tc>
-      </w:tr>
-      <w:tr>
-        <w:tc>
-          <w:tcPr>
-            <w:tcW w:type="dxa" w:w="5040"/>
-          </w:tcPr>
-          <w:p>
-            <w:r>
-              <w:t>UPI Lite (5.17)</w:t>
-            </w:r>
-          </w:p>
-        </w:tc>
-        <w:tc>
-          <w:tcPr>
-            <w:tcW w:type="dxa" w:w="5040"/>
-          </w:tcPr>
-          <w:p>
-            <w:r>
-              <w:t>≥1 SUCCESS with note containing UPI LITE in first 30d after first payout</w:t>
-            </w:r>
-          </w:p>
-        </w:tc>
-      </w:tr>
-    </w:tbl>
-    <w:p>
-      <w:r>
-        <w:rPr>
-          <w:b w:val="0"/>
-          <w:i/>
-        </w:rPr>
-        <w:t>Key takeaway: All lens slides use the same payout definition and BigQuery upi dataset — comparable across 5.1–5.17.</w:t>
+        <w:t>Key takeaway: 32 slides in deck (data-sources + 5.3 omitted) — scale &amp; sources above; Part A (4–28); Part B (29–34) → priorities on slide 34 .</w:t>
       </w:r>
     </w:p>
     <w:p>
@@ -2162,7 +1912,7 @@
           <w:b w:val="0"/>
           <w:i w:val="0"/>
         </w:rPr>
-        <w:t>16 behavioural cuts on first-30d payout behaviour · pooled Aug 2025–Jan 2026 · press → or open the index on slide 26</w:t>
+        <w:t>15 behavioural cuts on first-30d payout behaviour · pooled Aug 2025–Jan 2026 · press → or open the index on slide 26</w:t>
       </w:r>
     </w:p>
     <w:p>
@@ -3879,1272 +3629,6 @@
           <w:i/>
         </w:rPr>
         <w:t>&lt;div class="table-panel"&gt; &lt;h3&gt;M+1 active users (pool)&lt;/h3&gt; &lt;table class="data"&gt; &lt;thead&gt;&lt;tr&gt;&lt;th&gt;Segment&lt;/th&gt;&lt;th class="bucket-rule-col"&gt;Bucket rule&lt;/th&gt;&lt;th&gt;M+1 users&lt;/th&gt;&lt;/tr&gt;&lt;/thead&gt; &lt;tbody&gt; &lt;tr&gt;&lt;td&gt;Light&lt;/td&gt;&lt;td class="bucket-rule-col"&gt;1 payout SUCCESS&lt;/td&gt;&lt;td&gt;7,340&lt;/td&gt;&lt;/tr&gt; &lt;tr&gt;&lt;td&gt;Medium&lt;/td&gt;&lt;td class="bucket-rule-col"&gt;2–5 payouts&lt;/td&gt;&lt;td&gt;54,923&lt;/td&gt;&lt;/tr&gt; &lt;tr&gt;&lt;td&gt;Heavy&lt;/td&gt;&lt;td class="bucket-rule-col"&gt;6–20 payouts&lt;/td&gt;&lt;td&gt;72,274&lt;/td&gt;&lt;/tr&gt; &lt;tr&gt;&lt;td&gt;Power&lt;/td&gt;&lt;td class="bucket-rule-col"&gt;21+ payouts&lt;/td&gt;&lt;td&gt;68,942&lt;/td&gt;&lt;/tr&gt; &lt;/tbody&gt; &lt;/table&gt; &lt;/div&gt;</w:t>
-      </w:r>
-    </w:p>
-    <w:p>
-      <w:r>
-        <w:br w:type="page"/>
-      </w:r>
-    </w:p>
-    <w:p>
-      <w:pPr>
-        <w:pStyle w:val="Heading1"/>
-      </w:pPr>
-      <w:r>
-        <w:t>Slide 8</w:t>
-      </w:r>
-    </w:p>
-    <w:p>
-      <w:pPr>
-        <w:pStyle w:val="Heading2"/>
-      </w:pPr>
-      <w:r>
-        <w:t>5.3 Onboarding month (`users.created_at`)</w:t>
-      </w:r>
-    </w:p>
-    <w:p>
-      <w:r>
-        <w:rPr>
-          <w:b w:val="0"/>
-          <w:i w:val="0"/>
-        </w:rPr>
-        <w:t>Onboarding month = users.created_at . M+0 = payout SUCCESS same month. Periods: M+0, M+1, M+2, M+3, M+6.</w:t>
-      </w:r>
-    </w:p>
-    <w:tbl>
-      <w:tblPr>
-        <w:tblStyle w:val="TableGrid"/>
-        <w:tblW w:type="auto" w:w="0"/>
-        <w:tblLook w:firstColumn="1" w:firstRow="1" w:lastColumn="0" w:lastRow="0" w:noHBand="0" w:noVBand="1" w:val="04A0"/>
-      </w:tblPr>
-      <w:tblGrid>
-        <w:gridCol w:w="1680"/>
-        <w:gridCol w:w="1680"/>
-        <w:gridCol w:w="1680"/>
-        <w:gridCol w:w="1680"/>
-        <w:gridCol w:w="1680"/>
-        <w:gridCol w:w="1680"/>
-      </w:tblGrid>
-      <w:tr>
-        <w:tc>
-          <w:tcPr>
-            <w:tcW w:type="dxa" w:w="1680"/>
-          </w:tcPr>
-          <w:p>
-            <w:r>
-              <w:rPr>
-                <w:b/>
-              </w:rPr>
-              <w:t>Onboarding</w:t>
-            </w:r>
-          </w:p>
-        </w:tc>
-        <w:tc>
-          <w:tcPr>
-            <w:tcW w:type="dxa" w:w="1680"/>
-          </w:tcPr>
-          <w:p>
-            <w:r>
-              <w:rPr>
-                <w:b/>
-              </w:rPr>
-              <w:t>Cohort</w:t>
-            </w:r>
-          </w:p>
-        </w:tc>
-        <w:tc>
-          <w:tcPr>
-            <w:tcW w:type="dxa" w:w="1680"/>
-          </w:tcPr>
-          <w:p>
-            <w:r>
-              <w:rPr>
-                <w:b/>
-              </w:rPr>
-              <w:t>M+0</w:t>
-            </w:r>
-          </w:p>
-        </w:tc>
-        <w:tc>
-          <w:tcPr>
-            <w:tcW w:type="dxa" w:w="1680"/>
-          </w:tcPr>
-          <w:p>
-            <w:r>
-              <w:rPr>
-                <w:b/>
-              </w:rPr>
-              <w:t>M+1</w:t>
-            </w:r>
-          </w:p>
-        </w:tc>
-        <w:tc>
-          <w:tcPr>
-            <w:tcW w:type="dxa" w:w="1680"/>
-          </w:tcPr>
-          <w:p>
-            <w:r>
-              <w:rPr>
-                <w:b/>
-              </w:rPr>
-              <w:t>M+3</w:t>
-            </w:r>
-          </w:p>
-        </w:tc>
-        <w:tc>
-          <w:tcPr>
-            <w:tcW w:type="dxa" w:w="1680"/>
-          </w:tcPr>
-          <w:p>
-            <w:r>
-              <w:rPr>
-                <w:b/>
-              </w:rPr>
-              <w:t>M+6</w:t>
-            </w:r>
-          </w:p>
-        </w:tc>
-      </w:tr>
-      <w:tr>
-        <w:tc>
-          <w:tcPr>
-            <w:tcW w:type="dxa" w:w="1680"/>
-          </w:tcPr>
-          <w:p>
-            <w:r>
-              <w:t>2025-03</w:t>
-            </w:r>
-          </w:p>
-        </w:tc>
-        <w:tc>
-          <w:tcPr>
-            <w:tcW w:type="dxa" w:w="1680"/>
-          </w:tcPr>
-          <w:p>
-            <w:r>
-              <w:t>298,764</w:t>
-            </w:r>
-          </w:p>
-        </w:tc>
-        <w:tc>
-          <w:tcPr>
-            <w:tcW w:type="dxa" w:w="1680"/>
-          </w:tcPr>
-          <w:p>
-            <w:r>
-              <w:t>26.91</w:t>
-            </w:r>
-          </w:p>
-        </w:tc>
-        <w:tc>
-          <w:tcPr>
-            <w:tcW w:type="dxa" w:w="1680"/>
-          </w:tcPr>
-          <w:p>
-            <w:r>
-              <w:t>7.68</w:t>
-            </w:r>
-          </w:p>
-        </w:tc>
-        <w:tc>
-          <w:tcPr>
-            <w:tcW w:type="dxa" w:w="1680"/>
-          </w:tcPr>
-          <w:p>
-            <w:r>
-              <w:t>1.61</w:t>
-            </w:r>
-          </w:p>
-        </w:tc>
-        <w:tc>
-          <w:tcPr>
-            <w:tcW w:type="dxa" w:w="1680"/>
-          </w:tcPr>
-          <w:p>
-            <w:r>
-              <w:t>1.83</w:t>
-            </w:r>
-          </w:p>
-        </w:tc>
-      </w:tr>
-      <w:tr>
-        <w:tc>
-          <w:tcPr>
-            <w:tcW w:type="dxa" w:w="1680"/>
-          </w:tcPr>
-          <w:p>
-            <w:r>
-              <w:t>2025-04</w:t>
-            </w:r>
-          </w:p>
-        </w:tc>
-        <w:tc>
-          <w:tcPr>
-            <w:tcW w:type="dxa" w:w="1680"/>
-          </w:tcPr>
-          <w:p>
-            <w:r>
-              <w:t>145,252</w:t>
-            </w:r>
-          </w:p>
-        </w:tc>
-        <w:tc>
-          <w:tcPr>
-            <w:tcW w:type="dxa" w:w="1680"/>
-          </w:tcPr>
-          <w:p>
-            <w:r>
-              <w:t>26.09</w:t>
-            </w:r>
-          </w:p>
-        </w:tc>
-        <w:tc>
-          <w:tcPr>
-            <w:tcW w:type="dxa" w:w="1680"/>
-          </w:tcPr>
-          <w:p>
-            <w:r>
-              <w:t>6.69</w:t>
-            </w:r>
-          </w:p>
-        </w:tc>
-        <w:tc>
-          <w:tcPr>
-            <w:tcW w:type="dxa" w:w="1680"/>
-          </w:tcPr>
-          <w:p>
-            <w:r>
-              <w:t>2.26</w:t>
-            </w:r>
-          </w:p>
-        </w:tc>
-        <w:tc>
-          <w:tcPr>
-            <w:tcW w:type="dxa" w:w="1680"/>
-          </w:tcPr>
-          <w:p>
-            <w:r>
-              <w:t>2.14</w:t>
-            </w:r>
-          </w:p>
-        </w:tc>
-      </w:tr>
-      <w:tr>
-        <w:tc>
-          <w:tcPr>
-            <w:tcW w:type="dxa" w:w="1680"/>
-          </w:tcPr>
-          <w:p>
-            <w:r>
-              <w:t>2025-05</w:t>
-            </w:r>
-          </w:p>
-        </w:tc>
-        <w:tc>
-          <w:tcPr>
-            <w:tcW w:type="dxa" w:w="1680"/>
-          </w:tcPr>
-          <w:p>
-            <w:r>
-              <w:t>174,247</w:t>
-            </w:r>
-          </w:p>
-        </w:tc>
-        <w:tc>
-          <w:tcPr>
-            <w:tcW w:type="dxa" w:w="1680"/>
-          </w:tcPr>
-          <w:p>
-            <w:r>
-              <w:t>26.45</w:t>
-            </w:r>
-          </w:p>
-        </w:tc>
-        <w:tc>
-          <w:tcPr>
-            <w:tcW w:type="dxa" w:w="1680"/>
-          </w:tcPr>
-          <w:p>
-            <w:r>
-              <w:t>5.68</w:t>
-            </w:r>
-          </w:p>
-        </w:tc>
-        <w:tc>
-          <w:tcPr>
-            <w:tcW w:type="dxa" w:w="1680"/>
-          </w:tcPr>
-          <w:p>
-            <w:r>
-              <w:t>2.65</w:t>
-            </w:r>
-          </w:p>
-        </w:tc>
-        <w:tc>
-          <w:tcPr>
-            <w:tcW w:type="dxa" w:w="1680"/>
-          </w:tcPr>
-          <w:p>
-            <w:r>
-              <w:t>2.10</w:t>
-            </w:r>
-          </w:p>
-        </w:tc>
-      </w:tr>
-      <w:tr>
-        <w:tc>
-          <w:tcPr>
-            <w:tcW w:type="dxa" w:w="1680"/>
-          </w:tcPr>
-          <w:p>
-            <w:r>
-              <w:t>2025-06</w:t>
-            </w:r>
-          </w:p>
-        </w:tc>
-        <w:tc>
-          <w:tcPr>
-            <w:tcW w:type="dxa" w:w="1680"/>
-          </w:tcPr>
-          <w:p>
-            <w:r>
-              <w:t>112,109</w:t>
-            </w:r>
-          </w:p>
-        </w:tc>
-        <w:tc>
-          <w:tcPr>
-            <w:tcW w:type="dxa" w:w="1680"/>
-          </w:tcPr>
-          <w:p>
-            <w:r>
-              <w:t>25.54</w:t>
-            </w:r>
-          </w:p>
-        </w:tc>
-        <w:tc>
-          <w:tcPr>
-            <w:tcW w:type="dxa" w:w="1680"/>
-          </w:tcPr>
-          <w:p>
-            <w:r>
-              <w:t>9.03</w:t>
-            </w:r>
-          </w:p>
-        </w:tc>
-        <w:tc>
-          <w:tcPr>
-            <w:tcW w:type="dxa" w:w="1680"/>
-          </w:tcPr>
-          <w:p>
-            <w:r>
-              <w:t>3.49</w:t>
-            </w:r>
-          </w:p>
-        </w:tc>
-        <w:tc>
-          <w:tcPr>
-            <w:tcW w:type="dxa" w:w="1680"/>
-          </w:tcPr>
-          <w:p>
-            <w:r>
-              <w:t>2.77</w:t>
-            </w:r>
-          </w:p>
-        </w:tc>
-      </w:tr>
-      <w:tr>
-        <w:tc>
-          <w:tcPr>
-            <w:tcW w:type="dxa" w:w="1680"/>
-          </w:tcPr>
-          <w:p>
-            <w:r>
-              <w:t>2025-07</w:t>
-            </w:r>
-          </w:p>
-        </w:tc>
-        <w:tc>
-          <w:tcPr>
-            <w:tcW w:type="dxa" w:w="1680"/>
-          </w:tcPr>
-          <w:p>
-            <w:r>
-              <w:t>313,677</w:t>
-            </w:r>
-          </w:p>
-        </w:tc>
-        <w:tc>
-          <w:tcPr>
-            <w:tcW w:type="dxa" w:w="1680"/>
-          </w:tcPr>
-          <w:p>
-            <w:r>
-              <w:t>34.79</w:t>
-            </w:r>
-          </w:p>
-        </w:tc>
-        <w:tc>
-          <w:tcPr>
-            <w:tcW w:type="dxa" w:w="1680"/>
-          </w:tcPr>
-          <w:p>
-            <w:r>
-              <w:t>9.84</w:t>
-            </w:r>
-          </w:p>
-        </w:tc>
-        <w:tc>
-          <w:tcPr>
-            <w:tcW w:type="dxa" w:w="1680"/>
-          </w:tcPr>
-          <w:p>
-            <w:r>
-              <w:t>3.92</w:t>
-            </w:r>
-          </w:p>
-        </w:tc>
-        <w:tc>
-          <w:tcPr>
-            <w:tcW w:type="dxa" w:w="1680"/>
-          </w:tcPr>
-          <w:p>
-            <w:r>
-              <w:t>2.97</w:t>
-            </w:r>
-          </w:p>
-        </w:tc>
-      </w:tr>
-      <w:tr>
-        <w:tc>
-          <w:tcPr>
-            <w:tcW w:type="dxa" w:w="1680"/>
-          </w:tcPr>
-          <w:p>
-            <w:r>
-              <w:t>2025-08</w:t>
-            </w:r>
-          </w:p>
-        </w:tc>
-        <w:tc>
-          <w:tcPr>
-            <w:tcW w:type="dxa" w:w="1680"/>
-          </w:tcPr>
-          <w:p>
-            <w:r>
-              <w:t>347,187</w:t>
-            </w:r>
-          </w:p>
-        </w:tc>
-        <w:tc>
-          <w:tcPr>
-            <w:tcW w:type="dxa" w:w="1680"/>
-          </w:tcPr>
-          <w:p>
-            <w:r>
-              <w:t>38.36</w:t>
-            </w:r>
-          </w:p>
-        </w:tc>
-        <w:tc>
-          <w:tcPr>
-            <w:tcW w:type="dxa" w:w="1680"/>
-          </w:tcPr>
-          <w:p>
-            <w:r>
-              <w:t>11.01</w:t>
-            </w:r>
-          </w:p>
-        </w:tc>
-        <w:tc>
-          <w:tcPr>
-            <w:tcW w:type="dxa" w:w="1680"/>
-          </w:tcPr>
-          <w:p>
-            <w:r>
-              <w:t>4.64</w:t>
-            </w:r>
-          </w:p>
-        </w:tc>
-        <w:tc>
-          <w:tcPr>
-            <w:tcW w:type="dxa" w:w="1680"/>
-          </w:tcPr>
-          <w:p>
-            <w:r>
-              <w:t>3.27</w:t>
-            </w:r>
-          </w:p>
-        </w:tc>
-      </w:tr>
-      <w:tr>
-        <w:tc>
-          <w:tcPr>
-            <w:tcW w:type="dxa" w:w="1680"/>
-          </w:tcPr>
-          <w:p>
-            <w:r>
-              <w:t>2025-09</w:t>
-            </w:r>
-          </w:p>
-        </w:tc>
-        <w:tc>
-          <w:tcPr>
-            <w:tcW w:type="dxa" w:w="1680"/>
-          </w:tcPr>
-          <w:p>
-            <w:r>
-              <w:t>286,581</w:t>
-            </w:r>
-          </w:p>
-        </w:tc>
-        <w:tc>
-          <w:tcPr>
-            <w:tcW w:type="dxa" w:w="1680"/>
-          </w:tcPr>
-          <w:p>
-            <w:r>
-              <w:t>38.45</w:t>
-            </w:r>
-          </w:p>
-        </w:tc>
-        <w:tc>
-          <w:tcPr>
-            <w:tcW w:type="dxa" w:w="1680"/>
-          </w:tcPr>
-          <w:p>
-            <w:r>
-              <w:t>11.33</w:t>
-            </w:r>
-          </w:p>
-        </w:tc>
-        <w:tc>
-          <w:tcPr>
-            <w:tcW w:type="dxa" w:w="1680"/>
-          </w:tcPr>
-          <w:p>
-            <w:r>
-              <w:t>5.41</w:t>
-            </w:r>
-          </w:p>
-        </w:tc>
-        <w:tc>
-          <w:tcPr>
-            <w:tcW w:type="dxa" w:w="1680"/>
-          </w:tcPr>
-          <w:p>
-            <w:r>
-              <w:t>3.48</w:t>
-            </w:r>
-          </w:p>
-        </w:tc>
-      </w:tr>
-      <w:tr>
-        <w:tc>
-          <w:tcPr>
-            <w:tcW w:type="dxa" w:w="1680"/>
-          </w:tcPr>
-          <w:p>
-            <w:r>
-              <w:t>2025-10</w:t>
-            </w:r>
-          </w:p>
-        </w:tc>
-        <w:tc>
-          <w:tcPr>
-            <w:tcW w:type="dxa" w:w="1680"/>
-          </w:tcPr>
-          <w:p>
-            <w:r>
-              <w:t>302,642</w:t>
-            </w:r>
-          </w:p>
-        </w:tc>
-        <w:tc>
-          <w:tcPr>
-            <w:tcW w:type="dxa" w:w="1680"/>
-          </w:tcPr>
-          <w:p>
-            <w:r>
-              <w:t>35.00</w:t>
-            </w:r>
-          </w:p>
-        </w:tc>
-        <w:tc>
-          <w:tcPr>
-            <w:tcW w:type="dxa" w:w="1680"/>
-          </w:tcPr>
-          <w:p>
-            <w:r>
-              <w:t>15.09</w:t>
-            </w:r>
-          </w:p>
-        </w:tc>
-        <w:tc>
-          <w:tcPr>
-            <w:tcW w:type="dxa" w:w="1680"/>
-          </w:tcPr>
-          <w:p>
-            <w:r>
-              <w:t>7.27</w:t>
-            </w:r>
-          </w:p>
-        </w:tc>
-        <w:tc>
-          <w:tcPr>
-            <w:tcW w:type="dxa" w:w="1680"/>
-          </w:tcPr>
-          <w:p>
-            <w:r>
-              <w:t>4.16</w:t>
-            </w:r>
-          </w:p>
-        </w:tc>
-      </w:tr>
-      <w:tr>
-        <w:tc>
-          <w:tcPr>
-            <w:tcW w:type="dxa" w:w="1680"/>
-          </w:tcPr>
-          <w:p>
-            <w:r>
-              <w:t>2025-11</w:t>
-            </w:r>
-          </w:p>
-        </w:tc>
-        <w:tc>
-          <w:tcPr>
-            <w:tcW w:type="dxa" w:w="1680"/>
-          </w:tcPr>
-          <w:p>
-            <w:r>
-              <w:t>255,741</w:t>
-            </w:r>
-          </w:p>
-        </w:tc>
-        <w:tc>
-          <w:tcPr>
-            <w:tcW w:type="dxa" w:w="1680"/>
-          </w:tcPr>
-          <w:p>
-            <w:r>
-              <w:t>32.69</w:t>
-            </w:r>
-          </w:p>
-        </w:tc>
-        <w:tc>
-          <w:tcPr>
-            <w:tcW w:type="dxa" w:w="1680"/>
-          </w:tcPr>
-          <w:p>
-            <w:r>
-              <w:t>14.50</w:t>
-            </w:r>
-          </w:p>
-        </w:tc>
-        <w:tc>
-          <w:tcPr>
-            <w:tcW w:type="dxa" w:w="1680"/>
-          </w:tcPr>
-          <w:p>
-            <w:r>
-              <w:t>6.68</w:t>
-            </w:r>
-          </w:p>
-        </w:tc>
-        <w:tc>
-          <w:tcPr>
-            <w:tcW w:type="dxa" w:w="1680"/>
-          </w:tcPr>
-          <w:p>
-            <w:r>
-              <w:t>3.88</w:t>
-            </w:r>
-          </w:p>
-        </w:tc>
-      </w:tr>
-      <w:tr>
-        <w:tc>
-          <w:tcPr>
-            <w:tcW w:type="dxa" w:w="1680"/>
-          </w:tcPr>
-          <w:p>
-            <w:r>
-              <w:t>2025-12</w:t>
-            </w:r>
-          </w:p>
-        </w:tc>
-        <w:tc>
-          <w:tcPr>
-            <w:tcW w:type="dxa" w:w="1680"/>
-          </w:tcPr>
-          <w:p>
-            <w:r>
-              <w:t>249,631</w:t>
-            </w:r>
-          </w:p>
-        </w:tc>
-        <w:tc>
-          <w:tcPr>
-            <w:tcW w:type="dxa" w:w="1680"/>
-          </w:tcPr>
-          <w:p>
-            <w:r>
-              <w:t>30.16</w:t>
-            </w:r>
-          </w:p>
-        </w:tc>
-        <w:tc>
-          <w:tcPr>
-            <w:tcW w:type="dxa" w:w="1680"/>
-          </w:tcPr>
-          <w:p>
-            <w:r>
-              <w:t>13.23</w:t>
-            </w:r>
-          </w:p>
-        </w:tc>
-        <w:tc>
-          <w:tcPr>
-            <w:tcW w:type="dxa" w:w="1680"/>
-          </w:tcPr>
-          <w:p>
-            <w:r>
-              <w:t>6.11</w:t>
-            </w:r>
-          </w:p>
-        </w:tc>
-        <w:tc>
-          <w:tcPr>
-            <w:tcW w:type="dxa" w:w="1680"/>
-          </w:tcPr>
-          <w:p>
-            <w:r>
-              <w:t>—</w:t>
-            </w:r>
-          </w:p>
-        </w:tc>
-      </w:tr>
-      <w:tr>
-        <w:tc>
-          <w:tcPr>
-            <w:tcW w:type="dxa" w:w="1680"/>
-          </w:tcPr>
-          <w:p>
-            <w:r>
-              <w:t>2026-01</w:t>
-            </w:r>
-          </w:p>
-        </w:tc>
-        <w:tc>
-          <w:tcPr>
-            <w:tcW w:type="dxa" w:w="1680"/>
-          </w:tcPr>
-          <w:p>
-            <w:r>
-              <w:t>254,952</w:t>
-            </w:r>
-          </w:p>
-        </w:tc>
-        <w:tc>
-          <w:tcPr>
-            <w:tcW w:type="dxa" w:w="1680"/>
-          </w:tcPr>
-          <w:p>
-            <w:r>
-              <w:t>27.55</w:t>
-            </w:r>
-          </w:p>
-        </w:tc>
-        <w:tc>
-          <w:tcPr>
-            <w:tcW w:type="dxa" w:w="1680"/>
-          </w:tcPr>
-          <w:p>
-            <w:r>
-              <w:t>11.90</w:t>
-            </w:r>
-          </w:p>
-        </w:tc>
-        <w:tc>
-          <w:tcPr>
-            <w:tcW w:type="dxa" w:w="1680"/>
-          </w:tcPr>
-          <w:p>
-            <w:r>
-              <w:t>5.42</w:t>
-            </w:r>
-          </w:p>
-        </w:tc>
-        <w:tc>
-          <w:tcPr>
-            <w:tcW w:type="dxa" w:w="1680"/>
-          </w:tcPr>
-          <w:p>
-            <w:r>
-              <w:t>—</w:t>
-            </w:r>
-          </w:p>
-        </w:tc>
-      </w:tr>
-      <w:tr>
-        <w:tc>
-          <w:tcPr>
-            <w:tcW w:type="dxa" w:w="1680"/>
-          </w:tcPr>
-          <w:p>
-            <w:r>
-              <w:t>2026-02</w:t>
-            </w:r>
-          </w:p>
-        </w:tc>
-        <w:tc>
-          <w:tcPr>
-            <w:tcW w:type="dxa" w:w="1680"/>
-          </w:tcPr>
-          <w:p>
-            <w:r>
-              <w:t>281,793</w:t>
-            </w:r>
-          </w:p>
-        </w:tc>
-        <w:tc>
-          <w:tcPr>
-            <w:tcW w:type="dxa" w:w="1680"/>
-          </w:tcPr>
-          <w:p>
-            <w:r>
-              <w:t>31.67</w:t>
-            </w:r>
-          </w:p>
-        </w:tc>
-        <w:tc>
-          <w:tcPr>
-            <w:tcW w:type="dxa" w:w="1680"/>
-          </w:tcPr>
-          <w:p>
-            <w:r>
-              <w:t>12.96</w:t>
-            </w:r>
-          </w:p>
-        </w:tc>
-        <w:tc>
-          <w:tcPr>
-            <w:tcW w:type="dxa" w:w="1680"/>
-          </w:tcPr>
-          <w:p>
-            <w:r>
-              <w:t>5.29</w:t>
-            </w:r>
-          </w:p>
-        </w:tc>
-        <w:tc>
-          <w:tcPr>
-            <w:tcW w:type="dxa" w:w="1680"/>
-          </w:tcPr>
-          <w:p>
-            <w:r>
-              <w:t>—</w:t>
-            </w:r>
-          </w:p>
-        </w:tc>
-      </w:tr>
-      <w:tr>
-        <w:tc>
-          <w:tcPr>
-            <w:tcW w:type="dxa" w:w="1680"/>
-          </w:tcPr>
-          <w:p>
-            <w:r>
-              <w:t>2026-03</w:t>
-            </w:r>
-          </w:p>
-        </w:tc>
-        <w:tc>
-          <w:tcPr>
-            <w:tcW w:type="dxa" w:w="1680"/>
-          </w:tcPr>
-          <w:p>
-            <w:r>
-              <w:t>286,418</w:t>
-            </w:r>
-          </w:p>
-        </w:tc>
-        <w:tc>
-          <w:tcPr>
-            <w:tcW w:type="dxa" w:w="1680"/>
-          </w:tcPr>
-          <w:p>
-            <w:r>
-              <w:t>29.26</w:t>
-            </w:r>
-          </w:p>
-        </w:tc>
-        <w:tc>
-          <w:tcPr>
-            <w:tcW w:type="dxa" w:w="1680"/>
-          </w:tcPr>
-          <w:p>
-            <w:r>
-              <w:t>11.38</w:t>
-            </w:r>
-          </w:p>
-        </w:tc>
-        <w:tc>
-          <w:tcPr>
-            <w:tcW w:type="dxa" w:w="1680"/>
-          </w:tcPr>
-          <w:p>
-            <w:r>
-              <w:t>—</w:t>
-            </w:r>
-          </w:p>
-        </w:tc>
-        <w:tc>
-          <w:tcPr>
-            <w:tcW w:type="dxa" w:w="1680"/>
-          </w:tcPr>
-          <w:p>
-            <w:r>
-              <w:t>—</w:t>
-            </w:r>
-          </w:p>
-        </w:tc>
-      </w:tr>
-      <w:tr>
-        <w:tc>
-          <w:tcPr>
-            <w:tcW w:type="dxa" w:w="1680"/>
-          </w:tcPr>
-          <w:p>
-            <w:r>
-              <w:t>2026-04</w:t>
-            </w:r>
-          </w:p>
-        </w:tc>
-        <w:tc>
-          <w:tcPr>
-            <w:tcW w:type="dxa" w:w="1680"/>
-          </w:tcPr>
-          <w:p>
-            <w:r>
-              <w:t>255,950</w:t>
-            </w:r>
-          </w:p>
-        </w:tc>
-        <w:tc>
-          <w:tcPr>
-            <w:tcW w:type="dxa" w:w="1680"/>
-          </w:tcPr>
-          <w:p>
-            <w:r>
-              <w:t>25.32</w:t>
-            </w:r>
-          </w:p>
-        </w:tc>
-        <w:tc>
-          <w:tcPr>
-            <w:tcW w:type="dxa" w:w="1680"/>
-          </w:tcPr>
-          <w:p>
-            <w:r>
-              <w:t>10.18</w:t>
-            </w:r>
-          </w:p>
-        </w:tc>
-        <w:tc>
-          <w:tcPr>
-            <w:tcW w:type="dxa" w:w="1680"/>
-          </w:tcPr>
-          <w:p>
-            <w:r>
-              <w:t>—</w:t>
-            </w:r>
-          </w:p>
-        </w:tc>
-        <w:tc>
-          <w:tcPr>
-            <w:tcW w:type="dxa" w:w="1680"/>
-          </w:tcPr>
-          <w:p>
-            <w:r>
-              <w:t>—</w:t>
-            </w:r>
-          </w:p>
-        </w:tc>
-      </w:tr>
-    </w:tbl>
-    <w:p>
-      <w:r>
-        <w:rPr>
-          <w:b w:val="0"/>
-          <w:i w:val="0"/>
-        </w:rPr>
-        <w:t>M+6 “—” = target month not yet complete (run date 2026-05-20).</w:t>
-      </w:r>
-    </w:p>
-    <w:p>
-      <w:r>
-        <w:rPr>
-          <w:b w:val="0"/>
-          <w:i/>
-        </w:rPr>
-        <w:t>Key takeaway: M+1 ~11–15% (onboarding) vs ~22–33% (first-payout cohort) — activate payout in signup month; M+0 only ~26–38%.</w:t>
-      </w:r>
-    </w:p>
-    <w:p>
-      <w:pPr>
-        <w:pStyle w:val="Heading3"/>
-      </w:pPr>
-      <w:r>
-        <w:t>HTML comment (not shown in live deck)</w:t>
-      </w:r>
-    </w:p>
-    <w:p>
-      <w:r>
-        <w:rPr>
-          <w:b w:val="0"/>
-          <w:i/>
-        </w:rPr>
-        <w:t>&lt;th&gt;M+2&lt;/th&gt;</w:t>
-      </w:r>
-    </w:p>
-    <w:p>
-      <w:pPr>
-        <w:pStyle w:val="Heading3"/>
-      </w:pPr>
-      <w:r>
-        <w:t>HTML comment (not shown in live deck)</w:t>
-      </w:r>
-    </w:p>
-    <w:p>
-      <w:r>
-        <w:rPr>
-          <w:b w:val="0"/>
-          <w:i/>
-        </w:rPr>
-        <w:t>&lt;td&gt;3.76&lt;/td&gt;</w:t>
-      </w:r>
-    </w:p>
-    <w:p>
-      <w:pPr>
-        <w:pStyle w:val="Heading3"/>
-      </w:pPr>
-      <w:r>
-        <w:t>HTML comment (not shown in live deck)</w:t>
-      </w:r>
-    </w:p>
-    <w:p>
-      <w:r>
-        <w:rPr>
-          <w:b w:val="0"/>
-          <w:i/>
-        </w:rPr>
-        <w:t>&lt;td&gt;3.00&lt;/td&gt;</w:t>
-      </w:r>
-    </w:p>
-    <w:p>
-      <w:pPr>
-        <w:pStyle w:val="Heading3"/>
-      </w:pPr>
-      <w:r>
-        <w:t>HTML comment (not shown in live deck)</w:t>
-      </w:r>
-    </w:p>
-    <w:p>
-      <w:r>
-        <w:rPr>
-          <w:b w:val="0"/>
-          <w:i/>
-        </w:rPr>
-        <w:t>&lt;td&gt;3.29&lt;/td&gt;</w:t>
-      </w:r>
-    </w:p>
-    <w:p>
-      <w:pPr>
-        <w:pStyle w:val="Heading3"/>
-      </w:pPr>
-      <w:r>
-        <w:t>HTML comment (not shown in live deck)</w:t>
-      </w:r>
-    </w:p>
-    <w:p>
-      <w:r>
-        <w:rPr>
-          <w:b w:val="0"/>
-          <w:i/>
-        </w:rPr>
-        <w:t>&lt;td&gt;4.43&lt;/td&gt;</w:t>
-      </w:r>
-    </w:p>
-    <w:p>
-      <w:pPr>
-        <w:pStyle w:val="Heading3"/>
-      </w:pPr>
-      <w:r>
-        <w:t>HTML comment (not shown in live deck)</w:t>
-      </w:r>
-    </w:p>
-    <w:p>
-      <w:r>
-        <w:rPr>
-          <w:b w:val="0"/>
-          <w:i/>
-        </w:rPr>
-        <w:t>&lt;td&gt;4.94&lt;/td&gt;</w:t>
-      </w:r>
-    </w:p>
-    <w:p>
-      <w:pPr>
-        <w:pStyle w:val="Heading3"/>
-      </w:pPr>
-      <w:r>
-        <w:t>HTML comment (not shown in live deck)</w:t>
-      </w:r>
-    </w:p>
-    <w:p>
-      <w:r>
-        <w:rPr>
-          <w:b w:val="0"/>
-          <w:i/>
-        </w:rPr>
-        <w:t>&lt;td&gt;5.75&lt;/td&gt;</w:t>
-      </w:r>
-    </w:p>
-    <w:p>
-      <w:pPr>
-        <w:pStyle w:val="Heading3"/>
-      </w:pPr>
-      <w:r>
-        <w:t>HTML comment (not shown in live deck)</w:t>
-      </w:r>
-    </w:p>
-    <w:p>
-      <w:r>
-        <w:rPr>
-          <w:b w:val="0"/>
-          <w:i/>
-        </w:rPr>
-        <w:t>&lt;td&gt;6.62&lt;/td&gt;</w:t>
-      </w:r>
-    </w:p>
-    <w:p>
-      <w:pPr>
-        <w:pStyle w:val="Heading3"/>
-      </w:pPr>
-      <w:r>
-        <w:t>HTML comment (not shown in live deck)</w:t>
-      </w:r>
-    </w:p>
-    <w:p>
-      <w:r>
-        <w:rPr>
-          <w:b w:val="0"/>
-          <w:i/>
-        </w:rPr>
-        <w:t>&lt;td&gt;9.16&lt;/td&gt;</w:t>
-      </w:r>
-    </w:p>
-    <w:p>
-      <w:pPr>
-        <w:pStyle w:val="Heading3"/>
-      </w:pPr>
-      <w:r>
-        <w:t>HTML comment (not shown in live deck)</w:t>
-      </w:r>
-    </w:p>
-    <w:p>
-      <w:r>
-        <w:rPr>
-          <w:b w:val="0"/>
-          <w:i/>
-        </w:rPr>
-        <w:t>&lt;td&gt;9.05&lt;/td&gt;</w:t>
-      </w:r>
-    </w:p>
-    <w:p>
-      <w:pPr>
-        <w:pStyle w:val="Heading3"/>
-      </w:pPr>
-      <w:r>
-        <w:t>HTML comment (not shown in live deck)</w:t>
-      </w:r>
-    </w:p>
-    <w:p>
-      <w:r>
-        <w:rPr>
-          <w:b w:val="0"/>
-          <w:i/>
-        </w:rPr>
-        <w:t>&lt;td&gt;7.63&lt;/td&gt;</w:t>
-      </w:r>
-    </w:p>
-    <w:p>
-      <w:pPr>
-        <w:pStyle w:val="Heading3"/>
-      </w:pPr>
-      <w:r>
-        <w:t>HTML comment (not shown in live deck)</w:t>
-      </w:r>
-    </w:p>
-    <w:p>
-      <w:r>
-        <w:rPr>
-          <w:b w:val="0"/>
-          <w:i/>
-        </w:rPr>
-        <w:t>&lt;td&gt;7.28&lt;/td&gt;</w:t>
-      </w:r>
-    </w:p>
-    <w:p>
-      <w:pPr>
-        <w:pStyle w:val="Heading3"/>
-      </w:pPr>
-      <w:r>
-        <w:t>HTML comment (not shown in live deck)</w:t>
-      </w:r>
-    </w:p>
-    <w:p>
-      <w:r>
-        <w:rPr>
-          <w:b w:val="0"/>
-          <w:i/>
-        </w:rPr>
-        <w:t>&lt;td&gt;7.41&lt;/td&gt;</w:t>
-      </w:r>
-    </w:p>
-    <w:p>
-      <w:pPr>
-        <w:pStyle w:val="Heading3"/>
-      </w:pPr>
-      <w:r>
-        <w:t>HTML comment (not shown in live deck)</w:t>
-      </w:r>
-    </w:p>
-    <w:p>
-      <w:r>
-        <w:rPr>
-          <w:b w:val="0"/>
-          <w:i/>
-        </w:rPr>
-        <w:t>&lt;td&gt;6.62&lt;/td&gt;</w:t>
-      </w:r>
-    </w:p>
-    <w:p>
-      <w:pPr>
-        <w:pStyle w:val="Heading3"/>
-      </w:pPr>
-      <w:r>
-        <w:t>HTML comment (not shown in live deck)</w:t>
-      </w:r>
-    </w:p>
-    <w:p>
-      <w:r>
-        <w:rPr>
-          <w:b w:val="0"/>
-          <w:i/>
-        </w:rPr>
-        <w:t>&lt;td&gt;—&lt;/td&gt;</w:t>
       </w:r>
     </w:p>
     <w:p>
@@ -13492,6 +11976,23 @@
       </w:r>
     </w:p>
     <w:p>
+      <w:pPr>
+        <w:pStyle w:val="Heading3"/>
+      </w:pPr>
+      <w:r>
+        <w:t>HTML comment (not shown in live deck)</w:t>
+      </w:r>
+    </w:p>
+    <w:p>
+      <w:r>
+        <w:rPr>
+          <w:b w:val="0"/>
+          <w:i/>
+        </w:rPr>
+        <w:t>5.3 omitted &lt;button class="lens-btn" data-goto="8" type="button"&gt;&lt;span class="tag"&gt;5.3&lt;/span&gt; Onboarding month&lt;span class="hint"&gt;M+1 ~11–15%&lt;/span&gt;&lt;/button&gt;</w:t>
+      </w:r>
+    </w:p>
+    <w:p>
       <w:r>
         <w:br w:type="page"/>
       </w:r>
@@ -13673,7 +12174,7 @@
           <w:b w:val="0"/>
           <w:i w:val="0"/>
         </w:rPr>
-        <w:t>25–26 Competitor playbooks</w:t>
+        <w:t>30–31 Competitor playbooks</w:t>
       </w:r>
     </w:p>
     <w:p>
@@ -13730,7 +12231,7 @@
           <w:b w:val="0"/>
           <w:i w:val="0"/>
         </w:rPr>
-        <w:t>Paytm · PhonePe · Google Pay — scale, QR &amp; utility habit loops</w:t>
+        <w:t>Paytm · PhonePe · Google Pay — ■ gold · ■ teal · ■ indigo · ■ pink = top unique strategies</w:t>
       </w:r>
     </w:p>
     <w:tbl>
@@ -13753,7 +12254,7 @@
               <w:rPr>
                 <w:b/>
               </w:rPr>
-              <w:t>Cashback Points &amp; Coins</w:t>
+              <w:t>Paytm Gold Campaign</w:t>
             </w:r>
           </w:p>
         </w:tc>
@@ -13763,7 +12264,7 @@
           </w:tcPr>
           <w:p>
             <w:r>
-              <w:t>Coins awarded on UPI payments redeemable for Paytm Gold, vouchers, or partner rewards. Encourages repeat payment behavior instead of one-time redemption.</w:t>
+              <w:t>Coins on UPI payments funnel into Paytm Gold savings — recurring micro-invest habit tied to every scan/pay, not one-time voucher burn.</w:t>
             </w:r>
           </w:p>
         </w:tc>
@@ -14402,7 +12903,7 @@
           <w:b w:val="0"/>
           <w:i w:val="0"/>
         </w:rPr>
-        <w:t>CRED · Navi · Super.money — usable rewards &amp; lightweight UX</w:t>
+        <w:t>CRED · Navi · Super.money — same colour key for highlighted unique strategies</w:t>
       </w:r>
     </w:p>
     <w:tbl>
@@ -14425,7 +12926,7 @@
               <w:rPr>
                 <w:b/>
               </w:rPr>
-              <w:t>Cashback for First Few UPI Payments</w:t>
+              <w:t>Cashback for First 5 UPI Payments</w:t>
             </w:r>
           </w:p>
         </w:tc>
@@ -14435,7 +12936,7 @@
           </w:tcPr>
           <w:p>
             <w:r>
-              <w:t>Aggressive onboarding rewards to convert first-time users into habitual UPI users.</w:t>
+              <w:t>Aggressive onboarding rewards to convert first-time users into habitual UPI users and then shifting gradually to third-party perks beyond cashback — e.g. free Uber One, Lenskart Gold, and other partner subscriptions/vouchers.</w:t>
             </w:r>
           </w:p>
         </w:tc>
@@ -14475,7 +12976,7 @@
               <w:rPr>
                 <w:b/>
               </w:rPr>
-              <w:t>CRED Coins Economy</w:t>
+              <w:t>Multi-bank link via SMS read</w:t>
             </w:r>
           </w:p>
         </w:tc>
@@ -14485,57 +12986,7 @@
           </w:tcPr>
           <w:p>
             <w:r>
-              <w:t>UPI transactions generate coins that unlock limited offers and rewards, encouraging more payment volume.</w:t>
-            </w:r>
-          </w:p>
-        </w:tc>
-      </w:tr>
-      <w:tr>
-        <w:tc>
-          <w:tcPr>
-            <w:tcW w:type="dxa" w:w="5040"/>
-          </w:tcPr>
-          <w:p>
-            <w:r>
-              <w:rPr>
-                <w:b/>
-              </w:rPr>
-              <w:t>Premium Reward Psychology</w:t>
-            </w:r>
-          </w:p>
-        </w:tc>
-        <w:tc>
-          <w:tcPr>
-            <w:tcW w:type="dxa" w:w="5040"/>
-          </w:tcPr>
-          <w:p>
-            <w:r>
-              <w:t>Limited-time and exclusive reward mechanics create aspirational engagement among high-spend users.</w:t>
-            </w:r>
-          </w:p>
-        </w:tc>
-      </w:tr>
-      <w:tr>
-        <w:tc>
-          <w:tcPr>
-            <w:tcW w:type="dxa" w:w="5040"/>
-          </w:tcPr>
-          <w:p>
-            <w:r>
-              <w:rPr>
-                <w:b/>
-              </w:rPr>
-              <w:t>Smooth Payment Experience</w:t>
-            </w:r>
-          </w:p>
-        </w:tc>
-        <w:tc>
-          <w:tcPr>
-            <w:tcW w:type="dxa" w:w="5040"/>
-          </w:tcPr>
-          <w:p>
-            <w:r>
-              <w:t>Fast animations, polished transitions, and premium UX increase emotional stickiness in payment journeys.</w:t>
+              <w:t>Promotes adding multiple bank accounts by reading SMS / account signals — deeper rail attachment and higher payment success options.</w:t>
             </w:r>
           </w:p>
         </w:tc>
@@ -14625,7 +13076,7 @@
               <w:rPr>
                 <w:b/>
               </w:rPr>
-              <w:t>Partner vouchers (active users)</w:t>
+              <w:t>Quick-commerce dead-user win-back</w:t>
             </w:r>
           </w:p>
         </w:tc>
@@ -14635,7 +13086,7 @@
           </w:tcPr>
           <w:p>
             <w:r>
-              <w:t>Active transactors unlock third-party perks beyond cashback — e.g. free Uber One, Lenskart Gold, and other partner subscriptions/vouchers.</w:t>
+              <w:t>Integrates with quick-commerce apps (Blinkit, Zepto, etc.) for dead user retention via cashback offers.</w:t>
             </w:r>
           </w:p>
         </w:tc>
@@ -14826,6 +13277,56 @@
           </w:p>
         </w:tc>
       </w:tr>
+      <w:tr>
+        <w:tc>
+          <w:tcPr>
+            <w:tcW w:type="dxa" w:w="5040"/>
+          </w:tcPr>
+          <w:p>
+            <w:r>
+              <w:rPr>
+                <w:b/>
+              </w:rPr>
+              <w:t>UPI Lite Promotion</w:t>
+            </w:r>
+          </w:p>
+        </w:tc>
+        <w:tc>
+          <w:tcPr>
+            <w:tcW w:type="dxa" w:w="5040"/>
+          </w:tcPr>
+          <w:p>
+            <w:r>
+              <w:t>Push to enable UPI Lite for tap-and-go low-value payments — faster repeat merchant &amp; P2P flows on weak networks.</w:t>
+            </w:r>
+          </w:p>
+        </w:tc>
+      </w:tr>
+      <w:tr>
+        <w:tc>
+          <w:tcPr>
+            <w:tcW w:type="dxa" w:w="5040"/>
+          </w:tcPr>
+          <w:p>
+            <w:r>
+              <w:rPr>
+                <w:b/>
+              </w:rPr>
+              <w:t>Quick-commerce dead-user win-back</w:t>
+            </w:r>
+          </w:p>
+        </w:tc>
+        <w:tc>
+          <w:tcPr>
+            <w:tcW w:type="dxa" w:w="5040"/>
+          </w:tcPr>
+          <w:p>
+            <w:r>
+              <w:t>Integrates with quick-commerce apps (Blinkit, Zepto, etc.) for dead user retention via cashback offers.</w:t>
+            </w:r>
+          </w:p>
+        </w:tc>
+      </w:tr>
     </w:tbl>
     <w:tbl>
       <w:tblPr>
@@ -15053,7 +13554,7 @@
           <w:b w:val="0"/>
           <w:i w:val="0"/>
         </w:rPr>
-        <w:t>BHIM — Govt-backed trust; UPI Lite on weak networks. Integrates with quick-commerce apps (Blinkit, Zepto, etc.) for actual cashback on grocery/quick orders — not abstract wallet points alone.</w:t>
+        <w:t>BHIM — NPCI-backed trust; UPI Lite on weak networks for fast low-value payments on weak connectivity.</w:t>
       </w:r>
     </w:p>
     <w:p>
@@ -15445,7 +13946,7 @@
         <w:pStyle w:val="Heading2"/>
       </w:pPr>
       <w:r>
-        <w:t>From patterns to product actions</w:t>
+        <w:t>From patterns to priorities</w:t>
       </w:r>
     </w:p>
     <w:p>
@@ -15454,7 +13955,7 @@
           <w:b w:val="0"/>
           <w:i w:val="0"/>
         </w:rPr>
-        <w:t>Six emerging patterns and Reddit sentiment are clear — next slide turns them into four concrete bets for BharatPe UPI (funnel, rewards, BBPS, high-LTV).</w:t>
+        <w:t>Six emerging patterns and Reddit sentiment are clear — next slide lists broad strategic priorities (what, not how) from our data, Play Store voice, and competition.</w:t>
       </w:r>
     </w:p>
     <w:p>
@@ -15463,7 +13964,7 @@
           <w:b w:val="0"/>
           <w:i/>
         </w:rPr>
-        <w:t>Key takeaway: Benchmarking is done — now what BharatPe should do in the next 90 days.</w:t>
+        <w:t>Key takeaway: Benchmarking is done — next: what BharatPe should prioritise , not implementation detail.</w:t>
       </w:r>
     </w:p>
     <w:p>
@@ -15493,7 +13994,7 @@
           <w:b w:val="0"/>
           <w:i w:val="0"/>
         </w:rPr>
-        <w:t>Synthesised from 17 lenses + Play Store (slides 23–25) , UPI × BBPS (slide 28) , and emerging patterns (slide 32)</w:t>
+        <w:t>Broad strategic priorities only — what , not how · from warehouse lenses, Play Store (23–25), competition (30–31), community (32)</w:t>
       </w:r>
     </w:p>
     <w:p>
@@ -15502,307 +14003,143 @@
           <w:b w:val="0"/>
           <w:i w:val="0"/>
         </w:rPr>
-        <w:t>North star: Lift payout M+1 (~28–33%) toward VPA M1 (~35–42%) by fixing week-0–1 friction, moving users up intensity tiers, anchoring monthly utility via BBPS, and matching market UX/reward patterns users already reward on Reddit.</w:t>
+        <w:t>North star: Close the gap between payout M+1 (~28–33%) and VPA M1 (~35–42%) by acting on what the data, reviews, and market already signal — priorities below, not implementation plans.</w:t>
+      </w:r>
+    </w:p>
+    <w:p>
+      <w:pPr>
+        <w:pStyle w:val="Heading3"/>
+      </w:pPr>
+      <w:r>
+        <w:t>Raise first-30d payout intensity</w:t>
       </w:r>
     </w:p>
     <w:p>
       <w:r>
         <w:rPr>
           <w:b w:val="0"/>
-          <w:i/>
-          <w:sz w:val="18"/>
+          <w:i w:val="0"/>
         </w:rPr>
-        <w:t>Slide 22 · Lenses 5.12–5.13, 5.2</w:t>
-      </w:r>
-    </w:p>
-    <w:p>
-      <w:pPr>
-        <w:pStyle w:val="Heading4"/>
-      </w:pPr>
-      <w:r>
-        <w:t>Fix week 0–1 payout funnel</w:t>
-      </w:r>
-    </w:p>
-    <w:p>
-      <w:pPr>
-        <w:pStyle w:val="ListBullet"/>
-      </w:pPr>
-      <w:r>
-        <w:t>Cut FAILED-first outward (~22% of pool) — clearer errors, retry, bank-switch (FAIL-first ~13% M+1 vs SUCCESS-first ~28% )</w:t>
-      </w:r>
-    </w:p>
-    <w:p>
-      <w:pPr>
-        <w:pStyle w:val="ListBullet"/>
-      </w:pPr>
-      <w:r>
-        <w:t>Onboarding goal: 2+ payout SUCCESS in first 30d — escape Light ( ~2.6% M+1 ) toward Medium/Heavy ( 15–50%+ )</w:t>
-      </w:r>
-    </w:p>
-    <w:p>
-      <w:pPr>
-        <w:pStyle w:val="ListBullet"/>
-      </w:pPr>
-      <w:r>
-        <w:t>Guardrail on first 5 attempts : users with 0/5 SUCCESS ~ 25% M+1 vs 5/5 ~ 64% — intervene after 1–2 failures</w:t>
+        <w:t>Volume, pay-in, and multi-rail usage separate ~3% M+1 (Light) from ~50–88% (Heavy/Power); mixture rails outperform single-rail payers.</w:t>
+      </w:r>
+    </w:p>
+    <w:p>
+      <w:pPr>
+        <w:pStyle w:val="Heading3"/>
+      </w:pPr>
+      <w:r>
+        <w:t>Improve week-0 payment reliability</w:t>
       </w:r>
     </w:p>
     <w:p>
       <w:r>
         <w:rPr>
           <w:b w:val="0"/>
-          <w:i/>
-          <w:sz w:val="18"/>
+          <w:i w:val="0"/>
         </w:rPr>
-        <w:t>Slide 22 · Lenses 5.9–5.10, 5.6, 5.5</w:t>
-      </w:r>
-    </w:p>
-    <w:p>
-      <w:pPr>
-        <w:pStyle w:val="Heading4"/>
-      </w:pPr>
-      <w:r>
-        <w:t>Zillion, rails &amp; pay-in intensity</w:t>
-      </w:r>
-    </w:p>
-    <w:p>
-      <w:pPr>
-        <w:pStyle w:val="ListBullet"/>
-      </w:pPr>
-      <w:r>
-        <w:t>Drive Zillion redemption in first 30d (only ~ 3% redeem today; ~78% M+1 when they do) — prompt on 2nd successful payout</w:t>
-      </w:r>
-    </w:p>
-    <w:p>
-      <w:pPr>
-        <w:pStyle w:val="ListBullet"/>
-      </w:pPr>
-      <w:r>
-        <w:t>Fix payout-only earn measurement (~ 42% M+1 vs never-earn ~ 6% ); stop pay-in-only coin inflation</w:t>
-      </w:r>
-    </w:p>
-    <w:p>
-      <w:pPr>
-        <w:pStyle w:val="ListBullet"/>
-      </w:pPr>
-      <w:r>
-        <w:t>Multi-rail discovery: Mixture (QR + UPI ID + recharge) ~54% M+1 vs CONTACT-only ~ 2.3% ; nudge second rail by day 7</w:t>
-      </w:r>
-    </w:p>
-    <w:p>
-      <w:pPr>
-        <w:pStyle w:val="ListBullet"/>
-      </w:pPr>
-      <w:r>
-        <w:t>Rising pay-in volume in 30d tracks M+1 22% → 52% (Light → Power) — surface pay-in after first payout</w:t>
+        <w:t>FAILED-first outward and weak first-5 SUCCESS track to much lower M+1; reviews amplify crashes, login/OTP stalls, and server errors.</w:t>
+      </w:r>
+    </w:p>
+    <w:p>
+      <w:pPr>
+        <w:pStyle w:val="Heading3"/>
+      </w:pPr>
+      <w:r>
+        <w:t>Make Zillion &amp; rewards trustworthy</w:t>
       </w:r>
     </w:p>
     <w:p>
       <w:r>
         <w:rPr>
           <w:b w:val="0"/>
-          <w:i/>
-          <w:sz w:val="18"/>
+          <w:i w:val="0"/>
         </w:rPr>
-        <w:t>Slide 28 · UPI × BBPS</w:t>
-      </w:r>
-    </w:p>
-    <w:p>
-      <w:pPr>
-        <w:pStyle w:val="Heading4"/>
-      </w:pPr>
-      <w:r>
-        <w:t>BBPS attach &amp; monthly utility loop</w:t>
-      </w:r>
-    </w:p>
-    <w:p>
-      <w:pPr>
-        <w:pStyle w:val="ListBullet"/>
-      </w:pPr>
-      <w:r>
-        <w:t>Post first UPI SUCCESS : BBPS bill/recharge journey (today only ~ 17% attach within 1 week — raise attach rate)</w:t>
-      </w:r>
-    </w:p>
-    <w:p>
-      <w:pPr>
-        <w:pStyle w:val="ListBullet"/>
-      </w:pPr>
-      <w:r>
-        <w:t>BBPS users: ~2.7× txns/user and retention floor ~64–68% vs &lt;32% non-BBPS — prioritise BBPS in CRM tiers</w:t>
-      </w:r>
-    </w:p>
-    <w:p>
-      <w:pPr>
-        <w:pStyle w:val="ListBullet"/>
-      </w:pPr>
-      <w:r>
-        <w:t>Product: default utility tab , due-date nudges, AutoPay for repeat payers (aligns slide 32 pattern 4)</w:t>
-      </w:r>
-    </w:p>
-    <w:p>
-      <w:pPr>
-        <w:pStyle w:val="ListBullet"/>
-      </w:pPr>
-      <w:r>
-        <w:t>Ops: use NotebookLM BBPS LINK + calling deck for regional attach &amp; friction (scale: 6 → 103k users Jun 2024–Mar 2026)</w:t>
+        <w:t>Redemption and payout-linked earn correlate with retention; users and competitors expect spendable, bill-linked rewards — not missing or “fake” cashback.</w:t>
+      </w:r>
+    </w:p>
+    <w:p>
+      <w:pPr>
+        <w:pStyle w:val="Heading3"/>
+      </w:pPr>
+      <w:r>
+        <w:t>Anchor monthly utility (BBPS)</w:t>
       </w:r>
     </w:p>
     <w:p>
       <w:r>
         <w:rPr>
           <w:b w:val="0"/>
-          <w:i/>
-          <w:sz w:val="18"/>
+          <w:i w:val="0"/>
         </w:rPr>
-        <w:t>Slide 32 · Patterns 1, 3 + Reddit</w:t>
-      </w:r>
-    </w:p>
-    <w:p>
-      <w:pPr>
-        <w:pStyle w:val="Heading4"/>
-      </w:pPr>
-      <w:r>
-        <w:t>Speed, QR &amp; home-screen presence</w:t>
-      </w:r>
-    </w:p>
-    <w:p>
-      <w:pPr>
-        <w:pStyle w:val="ListBullet"/>
-      </w:pPr>
-      <w:r>
-        <w:t>Day-0 Scan QR widget / home-screen prompt (Paytm, Navi, Super.money pattern) — “open → scan → pay → exit”</w:t>
-      </w:r>
-    </w:p>
-    <w:p>
-      <w:pPr>
-        <w:pStyle w:val="ListBullet"/>
-      </w:pPr>
-      <w:r>
-        <w:t>Promote UPI Lite + low-latency QR path; fast retry after pending (PhonePe/BHIM benchmark)</w:t>
-      </w:r>
-    </w:p>
-    <w:p>
-      <w:pPr>
-        <w:pStyle w:val="ListBullet"/>
-      </w:pPr>
-      <w:r>
-        <w:t>Reduce UI clutter — community backlash on “bloated” UPI apps; keep payment path &lt;3 taps</w:t>
-      </w:r>
-    </w:p>
-    <w:p>
-      <w:pPr>
-        <w:pStyle w:val="ListBullet"/>
-      </w:pPr>
-      <w:r>
-        <w:t>Lock-screen / quick-pay shortcuts for repeat merchants &amp; contacts</w:t>
+        <w:t>BBPS attach shows a higher activity floor and txn depth; incumbents and challengers win on bill/recharge habit loops.</w:t>
+      </w:r>
+    </w:p>
+    <w:p>
+      <w:pPr>
+        <w:pStyle w:val="Heading3"/>
+      </w:pPr>
+      <w:r>
+        <w:t>Close the speed &amp; Lite gap</w:t>
       </w:r>
     </w:p>
     <w:p>
       <w:r>
         <w:rPr>
           <w:b w:val="0"/>
-          <w:i/>
-          <w:sz w:val="18"/>
+          <w:i w:val="0"/>
         </w:rPr>
-        <w:t>Slide 32 · Patterns 2, 5, 6</w:t>
-      </w:r>
-    </w:p>
-    <w:p>
-      <w:pPr>
-        <w:pStyle w:val="Heading4"/>
-      </w:pPr>
-      <w:r>
-        <w:t>Usable rewards &amp; contextual offers</w:t>
-      </w:r>
-    </w:p>
-    <w:p>
-      <w:pPr>
-        <w:pStyle w:val="ListBullet"/>
-      </w:pPr>
-      <w:r>
-        <w:t>Test bank cashback on 2nd &amp; 5th payout (Super.money / CRED) — spendable, not wallet-trapped coins</w:t>
-      </w:r>
-    </w:p>
-    <w:p>
-      <w:pPr>
-        <w:pStyle w:val="ListBullet"/>
-      </w:pPr>
-      <w:r>
-        <w:t>Contextual rewards: telecom/grocery MCC (~ 35% M+1 ), FASTag/electricity-style limited offers vs random scratch cards</w:t>
-      </w:r>
-    </w:p>
-    <w:p>
-      <w:pPr>
-        <w:pStyle w:val="ListBullet"/>
-      </w:pPr>
-      <w:r>
-        <w:t>Zillion: coins redeemable on bills &amp; recharge (CRED loop) — close the earn → spend cycle in-app</w:t>
-      </w:r>
-    </w:p>
-    <w:p>
-      <w:pPr>
-        <w:pStyle w:val="ListBullet"/>
-      </w:pPr>
-      <w:r>
-        <w:t>Lifecycle CRM : win-back for dormant payers; partner perks for active Power users (CRED Uber One / Lenskart model)</w:t>
+        <w:t>Slowness and instability dominate negative reviews (peaks Aug 2025, resurgence Mar–Apr 2026); market leaders promote UPI Lite, fast retry, and home-screen QR access.</w:t>
+      </w:r>
+    </w:p>
+    <w:p>
+      <w:pPr>
+        <w:pStyle w:val="Heading3"/>
+      </w:pPr>
+      <w:r>
+        <w:t>Protect brand trust</w:t>
       </w:r>
     </w:p>
     <w:p>
       <w:r>
         <w:rPr>
           <w:b w:val="0"/>
-          <w:i/>
-          <w:sz w:val="18"/>
+          <w:i w:val="0"/>
         </w:rPr>
-        <w:t>Slide 26 · Lenses 5.2, 5.8, 5.14–5.17</w:t>
-      </w:r>
-    </w:p>
-    <w:p>
-      <w:pPr>
-        <w:pStyle w:val="Heading4"/>
-      </w:pPr>
-      <w:r>
-        <w:t>Protect &amp; grow high-LTV cohorts</w:t>
-      </w:r>
-    </w:p>
-    <w:p>
-      <w:pPr>
-        <w:pStyle w:val="ListBullet"/>
-      </w:pPr>
-      <w:r>
-        <w:t>Power / Heavy / Mixture — priority support, fewer failure touchpoints; don’t over-incentivise Light-only users</w:t>
-      </w:r>
-    </w:p>
-    <w:p>
-      <w:pPr>
-        <w:pStyle w:val="ListBullet"/>
-      </w:pPr>
-      <w:r>
-        <w:t>BharatPe QR Mixed ~ 66% M+1 — expand merchant QR attach; template campaigns for top MCCs ( 15% → 47% M+1 by dominance)</w:t>
-      </w:r>
-    </w:p>
-    <w:p>
-      <w:pPr>
-        <w:pStyle w:val="ListBullet"/>
-      </w:pPr>
-      <w:r>
-        <w:t>4+ linked accounts ~ 50% M+1 ; CREDIT-dominant ~ 45% — credit-line UX &amp; bank-link nudges for credit-ready users</w:t>
-      </w:r>
-    </w:p>
-    <w:p>
-      <w:pPr>
-        <w:pStyle w:val="ListBullet"/>
-      </w:pPr>
-      <w:r>
-        <w:t>5+ UPI wallets on device ~ 29% M+1 (lens 5.15) — target multi-app payers; quick-commerce/travel installers ~ 34–36% M+1</w:t>
-      </w:r>
-    </w:p>
-    <w:p>
-      <w:pPr>
-        <w:pStyle w:val="ListBullet"/>
-      </w:pPr>
-      <w:r>
-        <w:t>Track TPV tiers: avg ticket 13% → 48% M+1 (lens 5.4) — tailor limits &amp; offers by bucket</w:t>
+        <w:t>Address fraud/scam perception, unfulfilled rewards, and loan-recovery harassment themes that erode willingness to keep paying on BharatPe.</w:t>
+      </w:r>
+    </w:p>
+    <w:p>
+      <w:pPr>
+        <w:pStyle w:val="Heading3"/>
+      </w:pPr>
+      <w:r>
+        <w:t>Focus on high-LTV cohorts</w:t>
+      </w:r>
+    </w:p>
+    <w:p>
+      <w:r>
+        <w:rPr>
+          <w:b w:val="0"/>
+          <w:i w:val="0"/>
+        </w:rPr>
+        <w:t>Power users, BharatPe QR mix, dominant MCCs, multi-wallet installers, and deeper bank linkage show materially higher M+1 — bulk savings base is weaker.</w:t>
+      </w:r>
+    </w:p>
+    <w:p>
+      <w:pPr>
+        <w:pStyle w:val="Heading3"/>
+      </w:pPr>
+      <w:r>
+        <w:t>Lifecycle presence &amp; win-back</w:t>
+      </w:r>
+    </w:p>
+    <w:p>
+      <w:r>
+        <w:rPr>
+          <w:b w:val="0"/>
+          <w:i w:val="0"/>
+        </w:rPr>
+        <w:t>Competitors invest in widgets, dead-user cashback, and q-commerce hooks; community wants minimal UI and consistent value — not bloat.</w:t>
       </w:r>
     </w:p>
     <w:p>
@@ -15811,119 +14148,7 @@
           <w:b w:val="0"/>
           <w:i/>
         </w:rPr>
-        <w:t>Key takeaway: Execute in three lanes — data-led intensity (slide 26), BBPS utility anchor (slide 28), and market-matched UX + rewards (slide 32) — to close the gap to VPA M1 retention.</w:t>
-      </w:r>
-    </w:p>
-    <w:p>
-      <w:r>
-        <w:br w:type="page"/>
-      </w:r>
-    </w:p>
-    <w:p>
-      <w:pPr>
-        <w:pStyle w:val="Heading1"/>
-      </w:pPr>
-      <w:r>
-        <w:t>Slide 35</w:t>
-      </w:r>
-    </w:p>
-    <w:p>
-      <w:pPr>
-        <w:pStyle w:val="Heading2"/>
-      </w:pPr>
-      <w:r>
-        <w:t>Future discussions — how can it be decided later?</w:t>
-      </w:r>
-    </w:p>
-    <w:p>
-      <w:r>
-        <w:rPr>
-          <w:b w:val="0"/>
-          <w:i w:val="0"/>
-        </w:rPr>
-        <w:t>Out of scope today; topics for a follow-up working session</w:t>
-      </w:r>
-    </w:p>
-    <w:p>
-      <w:pPr>
-        <w:pStyle w:val="ListBullet"/>
-      </w:pPr>
-      <w:r>
-        <w:t>Experiment design — holdout sizes, metric trees (VPA M1 vs payout M1 vs BBPS retention)</w:t>
-      </w:r>
-    </w:p>
-    <w:p>
-      <w:pPr>
-        <w:pStyle w:val="ListBullet"/>
-      </w:pPr>
-      <w:r>
-        <w:t>Incentive budget — ₹ cashback vs Zillion coins vs gold-coin analogue; CAC vs incremental M+2</w:t>
-      </w:r>
-    </w:p>
-    <w:p>
-      <w:pPr>
-        <w:pStyle w:val="ListBullet"/>
-      </w:pPr>
-      <w:r>
-        <w:t>Roadmap sequencing — tech deps (first-pay success, BBPS default tab, redemption API)</w:t>
-      </w:r>
-    </w:p>
-    <w:p>
-      <w:pPr>
-        <w:pStyle w:val="ListBullet"/>
-      </w:pPr>
-      <w:r>
-        <w:t>Regional playbook — South vs North BBPS attach (see linked BBPS deck)</w:t>
-      </w:r>
-    </w:p>
-    <w:p>
-      <w:pPr>
-        <w:pStyle w:val="ListBullet"/>
-      </w:pPr>
-      <w:r>
-        <w:t>Causal validation — propensity scoring on observational lenses (5.9, 5.8)</w:t>
-      </w:r>
-    </w:p>
-    <w:p>
-      <w:pPr>
-        <w:pStyle w:val="ListBullet"/>
-      </w:pPr>
-      <w:r>
-        <w:t>Ops &amp; resourcing — CRM, calling scripts, merchant MCC enrichment</w:t>
-      </w:r>
-    </w:p>
-    <w:p>
-      <w:pPr>
-        <w:pStyle w:val="ListBullet"/>
-      </w:pPr>
-      <w:r>
-        <w:t>Governance — refresh cadence for upi-retention-results.md / warehouse cuts</w:t>
-      </w:r>
-    </w:p>
-    <w:p>
-      <w:pPr>
-        <w:pStyle w:val="ListBullet"/>
-      </w:pPr>
-      <w:r>
-        <w:t>Stakeholder review — align product, growth, and data on priority lenses</w:t>
-      </w:r>
-    </w:p>
-    <w:p>
-      <w:r>
-        <w:rPr>
-          <w:b w:val="0"/>
-          <w:i w:val="0"/>
-        </w:rPr>
-        <w:t>Full data &amp; SQL: analyses/upi-retention-results.md · sql/upi-retention-queries.sql</w:t>
-      </w:r>
-    </w:p>
-    <w:p>
-      <w:r>
-        <w:rPr>
-          <w:b w:val="0"/>
-          <w:i/>
-        </w:rPr>
-        <w:t>Key takeaway: Decide later: experiment design , incentive budget, roadmap, regional BBPS, causal validation, ops, and refresh cadence.</w:t>
+        <w:t>Key takeaway: Eight strategic whats — intensity, reliability, rewards, utility, speed/Lite, trust, high-LTV focus, and lifecycle parity with the market.</w:t>
       </w:r>
     </w:p>
     <w:sectPr>

</xml_diff>

<commit_message>
Refine UPI retention deck with chapter intros, highlights, and refreshed exports.
Add chapter title slides and simplified agenda, M+6 max-row highlighting, BBPS and competitor updates, sentiment SQL source on slide 25, and refresh zip/docx portable exports.

Co-authored-by: Cursor <cursoragent@cursor.com>
</commit_message>
<xml_diff>
--- a/bharatpe-consumer/analyses/upi-retention-presentation/upi-retention-results.docx
+++ b/bharatpe-consumer/analyses/upi-retention-presentation/upi-retention-results.docx
@@ -115,38 +115,11 @@
       </w:r>
     </w:p>
     <w:p>
-      <w:r>
-        <w:rPr>
-          <w:b w:val="0"/>
-          <w:i w:val="0"/>
-        </w:rPr>
-        <w:t>~3M UPI IDs · ~60M txns · ~₹10,000 Cr TPV</w:t>
-      </w:r>
-    </w:p>
-    <w:p>
-      <w:r>
-        <w:rPr>
-          <w:b w:val="0"/>
-          <w:i w:val="0"/>
-        </w:rPr>
-        <w:t>Play Store (5.18–5.20): 101k+ reviews since Jan 2025 · keyword themes · month scores Jun 2025–May 2026</w:t>
-      </w:r>
-    </w:p>
-    <w:p>
-      <w:r>
-        <w:rPr>
-          <w:b w:val="0"/>
-          <w:i w:val="0"/>
-        </w:rPr>
-        <w:t>Community sentiments from 50k+ conversation (POST, COMMENT) on reddit, linkedin and X</w:t>
-      </w:r>
-    </w:p>
-    <w:p>
       <w:pPr>
         <w:pStyle w:val="ListBullet"/>
       </w:pPr>
       <w:r>
-        <w:t>Baseline retention — VPA created month, M+1–M+6 · ~720k payout cohort Aug 2025–Jan 2026 (4)</w:t>
+        <w:t>UPI Retention Today — Current state across the UPI ecosystem</w:t>
       </w:r>
     </w:p>
     <w:p>
@@ -154,7 +127,7 @@
         <w:pStyle w:val="ListBullet"/>
       </w:pPr>
       <w:r>
-        <w:t>Lens intro — 15 behavioural cuts, first-30d after first payout SUCCESS (5)</w:t>
+        <w:t>Retention Deep Dive — 3M+ UPI IDs · 60M+ txns · ₹10,000 Cr+ TPV</w:t>
       </w:r>
     </w:p>
     <w:p>
@@ -162,7 +135,7 @@
         <w:pStyle w:val="ListBullet"/>
       </w:pPr>
       <w:r>
-        <w:t>BigQuery lenses — 5.1–5.17 (a–q); 5.3 onboarding month omitted (6–7, 9–22) · SQL { } Source</w:t>
+        <w:t>BharatPe User Sentiment — 101K+ reviews · 12-month trend · keyword intelligence</w:t>
       </w:r>
     </w:p>
     <w:p>
@@ -170,7 +143,7 @@
         <w:pStyle w:val="ListBullet"/>
       </w:pPr>
       <w:r>
-        <w:t>Play Store 5.18 — six keyword sentiment themes (negative reviews) (23)</w:t>
+        <w:t>UPI × BBPS Retention Flywheel — Bill payments as a repeat habit engine</w:t>
       </w:r>
     </w:p>
     <w:p>
@@ -178,7 +151,7 @@
         <w:pStyle w:val="ListBullet"/>
       </w:pPr>
       <w:r>
-        <w:t>Play Store 5.19 — month-wise negative performance Jun 2025–May 2026 (24)</w:t>
+        <w:t>Competitive Retention Benchmarking — What top and new UPI apps are doing differently</w:t>
       </w:r>
     </w:p>
     <w:p>
@@ -186,7 +159,7 @@
         <w:pStyle w:val="ListBullet"/>
       </w:pPr>
       <w:r>
-        <w:t>Play Store 5.20 — verbatim 1–3★ &amp; custom review corpus (25)</w:t>
+        <w:t>Community Signals &amp; Emerging Patterns — 50K+ Reddit · X · LinkedIn discussions decoded</w:t>
       </w:r>
     </w:p>
     <w:p>
@@ -194,55 +167,7 @@
         <w:pStyle w:val="ListBullet"/>
       </w:pPr>
       <w:r>
-        <w:t>Lens index — jump to any lens or Play Store slide (26)</w:t>
-      </w:r>
-    </w:p>
-    <w:p>
-      <w:pPr>
-        <w:pStyle w:val="ListBullet"/>
-      </w:pPr>
-      <w:r>
-        <w:t>Story bridge — segmentation → BBPS ecosystem (27)</w:t>
-      </w:r>
-    </w:p>
-    <w:p>
-      <w:pPr>
-        <w:pStyle w:val="ListBullet"/>
-      </w:pPr>
-      <w:r>
-        <w:t>UPI × BBPS — attach, retention lift, NotebookLM + calling links (28)</w:t>
-      </w:r>
-    </w:p>
-    <w:p>
-      <w:pPr>
-        <w:pStyle w:val="ListBullet"/>
-      </w:pPr>
-      <w:r>
-        <w:t>Competitor landscape — intro; incumbents (Paytm, PhonePe, GPay…); challengers (CRED, Navi, Super.money) (29–31)</w:t>
-      </w:r>
-    </w:p>
-    <w:p>
-      <w:pPr>
-        <w:pStyle w:val="ListBullet"/>
-      </w:pPr>
-      <w:r>
-        <w:t>Emerging patterns — six community patterns (32)</w:t>
-      </w:r>
-    </w:p>
-    <w:p>
-      <w:pPr>
-        <w:pStyle w:val="ListBullet"/>
-      </w:pPr>
-      <w:r>
-        <w:t>Story bridge — patterns → strategic priorities (33)</w:t>
-      </w:r>
-    </w:p>
-    <w:p>
-      <w:pPr>
-        <w:pStyle w:val="ListBullet"/>
-      </w:pPr>
-      <w:r>
-        <w:t>What should be done? — broad strategic priorities (what, not how) (34)</w:t>
+        <w:t>What Must Change — Key retention levers &amp; opportunities</w:t>
       </w:r>
     </w:p>
     <w:p>
@@ -283,6 +208,54 @@
       </w:pPr>
       <w:r>
         <w:t>Slide 4</w:t>
+      </w:r>
+    </w:p>
+    <w:p>
+      <w:r>
+        <w:rPr>
+          <w:b w:val="0"/>
+          <w:i w:val="0"/>
+        </w:rPr>
+        <w:t>Chapter I · Ecosystem baseline</w:t>
+      </w:r>
+    </w:p>
+    <w:p>
+      <w:pPr>
+        <w:pStyle w:val="Heading2"/>
+      </w:pPr>
+      <w:r>
+        <w:t>UPI Retention Today</w:t>
+      </w:r>
+    </w:p>
+    <w:p>
+      <w:r>
+        <w:rPr>
+          <w:b w:val="0"/>
+          <w:i w:val="0"/>
+        </w:rPr>
+        <w:t>Current state across the UPI ecosystem — VPA cohort M+1–M+6</w:t>
+      </w:r>
+    </w:p>
+    <w:p>
+      <w:r>
+        <w:rPr>
+          <w:b w:val="0"/>
+          <w:i/>
+        </w:rPr>
+        <w:t>Key takeaway: Start with where BharatPe UPI retention stands before behavioural lenses and voice of customer.</w:t>
+      </w:r>
+    </w:p>
+    <w:p>
+      <w:r>
+        <w:br w:type="page"/>
+      </w:r>
+    </w:p>
+    <w:p>
+      <w:pPr>
+        <w:pStyle w:val="Heading1"/>
+      </w:pPr>
+      <w:r>
+        <w:t>Slide 5</w:t>
       </w:r>
     </w:p>
     <w:p>
@@ -1895,15 +1868,7 @@
         <w:pStyle w:val="Heading1"/>
       </w:pPr>
       <w:r>
-        <w:t>Slide 5</w:t>
-      </w:r>
-    </w:p>
-    <w:p>
-      <w:pPr>
-        <w:pStyle w:val="Heading2"/>
-      </w:pPr>
-      <w:r>
-        <w:t>UPI Retention through various other lens</w:t>
+        <w:t>Slide 6</w:t>
       </w:r>
     </w:p>
     <w:p>
@@ -1912,7 +1877,24 @@
           <w:b w:val="0"/>
           <w:i w:val="0"/>
         </w:rPr>
-        <w:t>15 behavioural cuts on first-30d payout behaviour · pooled Aug 2025–Jan 2026 · press → or open the index on slide 26</w:t>
+        <w:t>Chapter II · Warehouse deep dive</w:t>
+      </w:r>
+    </w:p>
+    <w:p>
+      <w:pPr>
+        <w:pStyle w:val="Heading2"/>
+      </w:pPr>
+      <w:r>
+        <w:t>Retention Deep Dive</w:t>
+      </w:r>
+    </w:p>
+    <w:p>
+      <w:r>
+        <w:rPr>
+          <w:b w:val="0"/>
+          <w:i w:val="0"/>
+        </w:rPr>
+        <w:t>3M+ UPI IDs · 60M+ txns · ₹10,000 Cr+ TPV · 15 behavioural lenses (first-30d after first payout) · press → · { } Source on each slide</w:t>
       </w:r>
     </w:p>
     <w:p>
@@ -1934,7 +1916,7 @@
         <w:pStyle w:val="Heading1"/>
       </w:pPr>
       <w:r>
-        <w:t>Slide 6</w:t>
+        <w:t>Slide 7</w:t>
       </w:r>
     </w:p>
     <w:p>
@@ -2628,7 +2610,7 @@
         <w:pStyle w:val="Heading1"/>
       </w:pPr>
       <w:r>
-        <w:t>Slide 7</w:t>
+        <w:t>Slide 8</w:t>
       </w:r>
     </w:p>
     <w:p>
@@ -3641,7 +3623,7 @@
         <w:pStyle w:val="Heading1"/>
       </w:pPr>
       <w:r>
-        <w:t>Slide 9</w:t>
+        <w:t>Slide 10</w:t>
       </w:r>
     </w:p>
     <w:p>
@@ -4403,7 +4385,7 @@
         <w:pStyle w:val="Heading1"/>
       </w:pPr>
       <w:r>
-        <w:t>Slide 10</w:t>
+        <w:t>Slide 11</w:t>
       </w:r>
     </w:p>
     <w:p>
@@ -5165,7 +5147,7 @@
         <w:pStyle w:val="Heading1"/>
       </w:pPr>
       <w:r>
-        <w:t>Slide 11</w:t>
+        <w:t>Slide 12</w:t>
       </w:r>
     </w:p>
     <w:p>
@@ -6036,7 +6018,7 @@
         <w:pStyle w:val="Heading1"/>
       </w:pPr>
       <w:r>
-        <w:t>Slide 12</w:t>
+        <w:t>Slide 13</w:t>
       </w:r>
     </w:p>
     <w:p>
@@ -7031,7 +7013,7 @@
         <w:pStyle w:val="Heading1"/>
       </w:pPr>
       <w:r>
-        <w:t>Slide 13</w:t>
+        <w:t>Slide 14</w:t>
       </w:r>
     </w:p>
     <w:p>
@@ -7495,7 +7477,7 @@
         <w:pStyle w:val="Heading1"/>
       </w:pPr>
       <w:r>
-        <w:t>Slide 14</w:t>
+        <w:t>Slide 15</w:t>
       </w:r>
     </w:p>
     <w:p>
@@ -7822,7 +7804,7 @@
         <w:pStyle w:val="Heading1"/>
       </w:pPr>
       <w:r>
-        <w:t>Slide 15</w:t>
+        <w:t>Slide 16</w:t>
       </w:r>
     </w:p>
     <w:p>
@@ -8140,7 +8122,7 @@
         <w:pStyle w:val="Heading1"/>
       </w:pPr>
       <w:r>
-        <w:t>Slide 16</w:t>
+        <w:t>Slide 17</w:t>
       </w:r>
     </w:p>
     <w:p>
@@ -8433,7 +8415,7 @@
         <w:pStyle w:val="Heading1"/>
       </w:pPr>
       <w:r>
-        <w:t>Slide 17</w:t>
+        <w:t>Slide 18</w:t>
       </w:r>
     </w:p>
     <w:p>
@@ -8839,7 +8821,7 @@
         <w:pStyle w:val="Heading1"/>
       </w:pPr>
       <w:r>
-        <w:t>Slide 18</w:t>
+        <w:t>Slide 19</w:t>
       </w:r>
     </w:p>
     <w:p>
@@ -9329,7 +9311,7 @@
         <w:pStyle w:val="Heading1"/>
       </w:pPr>
       <w:r>
-        <w:t>Slide 19</w:t>
+        <w:t>Slide 20</w:t>
       </w:r>
     </w:p>
     <w:p>
@@ -9768,7 +9750,7 @@
         <w:pStyle w:val="Heading1"/>
       </w:pPr>
       <w:r>
-        <w:t>Slide 20</w:t>
+        <w:t>Slide 21</w:t>
       </w:r>
     </w:p>
     <w:p>
@@ -10351,7 +10333,7 @@
         <w:pStyle w:val="Heading1"/>
       </w:pPr>
       <w:r>
-        <w:t>Slide 21</w:t>
+        <w:t>Slide 22</w:t>
       </w:r>
     </w:p>
     <w:p>
@@ -10749,7 +10731,7 @@
         <w:pStyle w:val="Heading1"/>
       </w:pPr>
       <w:r>
-        <w:t>Slide 22</w:t>
+        <w:t>Slide 23</w:t>
       </w:r>
     </w:p>
     <w:p>
@@ -11085,7 +11067,55 @@
         <w:pStyle w:val="Heading1"/>
       </w:pPr>
       <w:r>
-        <w:t>Slide 23</w:t>
+        <w:t>Slide 24</w:t>
+      </w:r>
+    </w:p>
+    <w:p>
+      <w:r>
+        <w:rPr>
+          <w:b w:val="0"/>
+          <w:i w:val="0"/>
+        </w:rPr>
+        <w:t>Chapter III · User voice</w:t>
+      </w:r>
+    </w:p>
+    <w:p>
+      <w:pPr>
+        <w:pStyle w:val="Heading2"/>
+      </w:pPr>
+      <w:r>
+        <w:t>BharatPe User Sentiment</w:t>
+      </w:r>
+    </w:p>
+    <w:p>
+      <w:r>
+        <w:rPr>
+          <w:b w:val="0"/>
+          <w:i w:val="0"/>
+        </w:rPr>
+        <w:t>101K+ Play Store reviews · 12-month trend · keyword intelligence · verbatim quotes</w:t>
+      </w:r>
+    </w:p>
+    <w:p>
+      <w:r>
+        <w:rPr>
+          <w:b w:val="0"/>
+          <w:i/>
+        </w:rPr>
+        <w:t>Key takeaway: Next — what users say in reviews: themes, month-wise pain, and real quotes.</w:t>
+      </w:r>
+    </w:p>
+    <w:p>
+      <w:r>
+        <w:br w:type="page"/>
+      </w:r>
+    </w:p>
+    <w:p>
+      <w:pPr>
+        <w:pStyle w:val="Heading1"/>
+      </w:pPr>
+      <w:r>
+        <w:t>Slide 25</w:t>
       </w:r>
     </w:p>
     <w:p>
@@ -11279,7 +11309,7 @@
         <w:pStyle w:val="Heading1"/>
       </w:pPr>
       <w:r>
-        <w:t>Slide 24</w:t>
+        <w:t>Slide 26</w:t>
       </w:r>
     </w:p>
     <w:p>
@@ -11763,7 +11793,7 @@
         <w:pStyle w:val="Heading1"/>
       </w:pPr>
       <w:r>
-        <w:t>Slide 25</w:t>
+        <w:t>Slide 27</w:t>
       </w:r>
     </w:p>
     <w:p>
@@ -11946,15 +11976,7 @@
         <w:pStyle w:val="Heading1"/>
       </w:pPr>
       <w:r>
-        <w:t>Slide 26</w:t>
-      </w:r>
-    </w:p>
-    <w:p>
-      <w:pPr>
-        <w:pStyle w:val="Heading2"/>
-      </w:pPr>
-      <w:r>
-        <w:t>5 Retention through various lenses</w:t>
+        <w:t>Slide 29</w:t>
       </w:r>
     </w:p>
     <w:p>
@@ -11963,7 +11985,24 @@
           <w:b w:val="0"/>
           <w:i w:val="0"/>
         </w:rPr>
-        <w:t>Label from first-30d after first payout SUCCESS → payout retention M+0…M+6 (unless noted).</w:t>
+        <w:t>Chapter IV · Ecosystem flywheel</w:t>
+      </w:r>
+    </w:p>
+    <w:p>
+      <w:pPr>
+        <w:pStyle w:val="Heading2"/>
+      </w:pPr>
+      <w:r>
+        <w:t>UPI × BBPS Retention Flywheel</w:t>
+      </w:r>
+    </w:p>
+    <w:p>
+      <w:r>
+        <w:rPr>
+          <w:b w:val="0"/>
+          <w:i w:val="0"/>
+        </w:rPr>
+        <w:t>Bill payments as a repeat habit engine — attach, depth, and retention lift</w:t>
       </w:r>
     </w:p>
     <w:p>
@@ -11972,24 +12011,7 @@
           <w:b w:val="0"/>
           <w:i/>
         </w:rPr>
-        <w:t>Key takeaway: Intensity (volume, pay-in, multi-rail) and Zillion redeem separate ~2% M+1 from ~80% M+1 — focus product on moving users up-tier in 30d.</w:t>
-      </w:r>
-    </w:p>
-    <w:p>
-      <w:pPr>
-        <w:pStyle w:val="Heading3"/>
-      </w:pPr>
-      <w:r>
-        <w:t>HTML comment (not shown in live deck)</w:t>
-      </w:r>
-    </w:p>
-    <w:p>
-      <w:r>
-        <w:rPr>
-          <w:b w:val="0"/>
-          <w:i/>
-        </w:rPr>
-        <w:t>5.3 omitted &lt;button class="lens-btn" data-goto="8" type="button"&gt;&lt;span class="tag"&gt;5.3&lt;/span&gt; Onboarding month&lt;span class="hint"&gt;M+1 ~11–15%&lt;/span&gt;&lt;/button&gt;</w:t>
+        <w:t>Key takeaway: Connect warehouse lenses to utility &amp; BBPS before competitive benchmarking.</w:t>
       </w:r>
     </w:p>
     <w:p>
@@ -12002,55 +12024,7 @@
         <w:pStyle w:val="Heading1"/>
       </w:pPr>
       <w:r>
-        <w:t>Slide 27</w:t>
-      </w:r>
-    </w:p>
-    <w:p>
-      <w:r>
-        <w:rPr>
-          <w:b w:val="0"/>
-          <w:i w:val="0"/>
-        </w:rPr>
-        <w:t>Chapter II · Connect the dots</w:t>
-      </w:r>
-    </w:p>
-    <w:p>
-      <w:pPr>
-        <w:pStyle w:val="Heading2"/>
-      </w:pPr>
-      <w:r>
-        <w:t>From segmentation to ecosystem</w:t>
-      </w:r>
-    </w:p>
-    <w:p>
-      <w:r>
-        <w:rPr>
-          <w:b w:val="0"/>
-          <w:i w:val="0"/>
-        </w:rPr>
-        <w:t>We've sliced payout retention seventeen ways — next, see how utility &amp; BBPS lift retention before benchmarking Paytm, PhonePe, and challengers.</w:t>
-      </w:r>
-    </w:p>
-    <w:p>
-      <w:r>
-        <w:rPr>
-          <w:b w:val="0"/>
-          <w:i/>
-        </w:rPr>
-        <w:t>Key takeaway: Internal diagnosis first → BBPS cross-sell → then look outside at competitors &amp; community.</w:t>
-      </w:r>
-    </w:p>
-    <w:p>
-      <w:r>
-        <w:br w:type="page"/>
-      </w:r>
-    </w:p>
-    <w:p>
-      <w:pPr>
-        <w:pStyle w:val="Heading1"/>
-      </w:pPr>
-      <w:r>
-        <w:t>Slide 28</w:t>
+        <w:t>Slide 30</w:t>
       </w:r>
     </w:p>
     <w:p>
@@ -12091,7 +12065,7 @@
         <w:pStyle w:val="ListBullet"/>
       </w:pPr>
       <w:r>
-        <w:t>~17% UPI → BBPS within 1 week</w:t>
+        <w:t>Pure UPI users do 7.6 transactions/month while UPI × BBPS users do 19.2 transactions/month .</w:t>
       </w:r>
     </w:p>
     <w:p>
@@ -12099,7 +12073,7 @@
         <w:pStyle w:val="ListBullet"/>
       </w:pPr>
       <w:r>
-        <w:t>Scale: 6 (Jun 2024) → 103,855 (Mar 2026)</w:t>
+        <w:t>Retention after first month: Pure UPI users at 32% vs UPI × BBPS users at 68% .</w:t>
       </w:r>
     </w:p>
     <w:p>
@@ -12121,7 +12095,7 @@
         <w:pStyle w:val="Heading1"/>
       </w:pPr>
       <w:r>
-        <w:t>Slide 29</w:t>
+        <w:t>Slide 31</w:t>
       </w:r>
     </w:p>
     <w:p>
@@ -12130,7 +12104,7 @@
           <w:b w:val="0"/>
           <w:i w:val="0"/>
         </w:rPr>
-        <w:t>Competitor insights</w:t>
+        <w:t>Chapter V · Competition</w:t>
       </w:r>
     </w:p>
     <w:p>
@@ -12139,7 +12113,15 @@
           <w:b w:val="0"/>
           <w:i w:val="0"/>
         </w:rPr>
-        <w:t>Community sentiment</w:t>
+        <w:t>Playbooks next →</w:t>
+      </w:r>
+    </w:p>
+    <w:p>
+      <w:pPr>
+        <w:pStyle w:val="Heading2"/>
+      </w:pPr>
+      <w:r>
+        <w:t>Competitive Retention Benchmarking</w:t>
       </w:r>
     </w:p>
     <w:p>
@@ -12148,15 +12130,7 @@
           <w:b w:val="0"/>
           <w:i w:val="0"/>
         </w:rPr>
-        <w:t>Emerging patterns</w:t>
-      </w:r>
-    </w:p>
-    <w:p>
-      <w:pPr>
-        <w:pStyle w:val="Heading2"/>
-      </w:pPr>
-      <w:r>
-        <w:t>Competitor insights, community sentiment &amp; emerging patterns</w:t>
+        <w:t>What top and new UPI apps are doing differently — incumbents (Paytm, PhonePe, GPay) and challengers (CRED, Navi, Super.money)</w:t>
       </w:r>
     </w:p>
     <w:p>
@@ -12165,7 +12139,7 @@
           <w:b w:val="0"/>
           <w:i w:val="0"/>
         </w:rPr>
-        <w:t>Deep-dive on what incumbents &amp; challengers do, what Reddit users reward, and six patterns BharatPe can act on · press →</w:t>
+        <w:t>Traditional incumbents</w:t>
       </w:r>
     </w:p>
     <w:p>
@@ -12174,16 +12148,7 @@
           <w:b w:val="0"/>
           <w:i w:val="0"/>
         </w:rPr>
-        <w:t>30–31 Competitor playbooks</w:t>
-      </w:r>
-    </w:p>
-    <w:p>
-      <w:r>
-        <w:rPr>
-          <w:b w:val="0"/>
-          <w:i w:val="0"/>
-        </w:rPr>
-        <w:t>27 Patterns + Reddit</w:t>
+        <w:t>New-age challengers</w:t>
       </w:r>
     </w:p>
     <w:p>
@@ -12201,7 +12166,7 @@
           <w:b w:val="0"/>
           <w:i/>
         </w:rPr>
-        <w:t>Key takeaway: Next — who competes how , what users say , and what’s changing in UPI retention.</w:t>
+        <w:t>Key takeaway: Benchmark retention playbooks before decoding community voice.</w:t>
       </w:r>
     </w:p>
     <w:p>
@@ -12214,7 +12179,7 @@
         <w:pStyle w:val="Heading1"/>
       </w:pPr>
       <w:r>
-        <w:t>Slide 30</w:t>
+        <w:t>Slide 32</w:t>
       </w:r>
     </w:p>
     <w:p>
@@ -12655,17 +12620,6 @@
           </w:p>
         </w:tc>
       </w:tr>
-    </w:tbl>
-    <w:tbl>
-      <w:tblPr>
-        <w:tblStyle w:val="TableGrid"/>
-        <w:tblW w:type="auto" w:w="0"/>
-        <w:tblLook w:firstColumn="1" w:firstRow="1" w:lastColumn="0" w:lastRow="0" w:noHBand="0" w:noVBand="1" w:val="04A0"/>
-      </w:tblPr>
-      <w:tblGrid>
-        <w:gridCol w:w="5040"/>
-        <w:gridCol w:w="5040"/>
-      </w:tblGrid>
       <w:tr>
         <w:tc>
           <w:tcPr>
@@ -12676,7 +12630,7 @@
               <w:rPr>
                 <w:b/>
               </w:rPr>
-              <w:t>Task-based Gamification</w:t>
+              <w:t>RuPay Credit Card linkage cashback</w:t>
             </w:r>
           </w:p>
         </w:tc>
@@ -12686,407 +12640,7 @@
           </w:tcPr>
           <w:p>
             <w:r>
-              <w:t>“Pay a friend,” “scan a QR,” “do a recharge,” or streak-based missions encourage broader UPI rail usage.</w:t>
-            </w:r>
-          </w:p>
-        </w:tc>
-      </w:tr>
-      <w:tr>
-        <w:tc>
-          <w:tcPr>
-            <w:tcW w:type="dxa" w:w="5040"/>
-          </w:tcPr>
-          <w:p>
-            <w:r>
-              <w:rPr>
-                <w:b/>
-              </w:rPr>
-              <w:t>Micro Social Nudges</w:t>
-            </w:r>
-          </w:p>
-        </w:tc>
-        <w:tc>
-          <w:tcPr>
-            <w:tcW w:type="dxa" w:w="5040"/>
-          </w:tcPr>
-          <w:p>
-            <w:r>
-              <w:t>₹1 gifting prompts, birthday reminders, and lightweight social payment interactions increase P2P frequency.</w:t>
-            </w:r>
-          </w:p>
-        </w:tc>
-      </w:tr>
-      <w:tr>
-        <w:tc>
-          <w:tcPr>
-            <w:tcW w:type="dxa" w:w="5040"/>
-          </w:tcPr>
-          <w:p>
-            <w:r>
-              <w:rPr>
-                <w:b/>
-              </w:rPr>
-              <w:t>Scratch Cards</w:t>
-            </w:r>
-          </w:p>
-        </w:tc>
-        <w:tc>
-          <w:tcPr>
-            <w:tcW w:type="dxa" w:w="5040"/>
-          </w:tcPr>
-          <w:p>
-            <w:r>
-              <w:t>Surprise rewards after transactions maintain engagement despite smaller cashback values.</w:t>
-            </w:r>
-          </w:p>
-        </w:tc>
-      </w:tr>
-      <w:tr>
-        <w:tc>
-          <w:tcPr>
-            <w:tcW w:type="dxa" w:w="5040"/>
-          </w:tcPr>
-          <w:p>
-            <w:r>
-              <w:rPr>
-                <w:b/>
-              </w:rPr>
-              <w:t>Time-bound Recharge Offers</w:t>
-            </w:r>
-          </w:p>
-        </w:tc>
-        <w:tc>
-          <w:tcPr>
-            <w:tcW w:type="dxa" w:w="5040"/>
-          </w:tcPr>
-          <w:p>
-            <w:r>
-              <w:t>Example: “Get ₹10 cashback on recharge above ₹200 within next 7 days.” Time-limited urgency drives repeat recharges and short-term retention.</w:t>
-            </w:r>
-          </w:p>
-        </w:tc>
-      </w:tr>
-      <w:tr>
-        <w:tc>
-          <w:tcPr>
-            <w:tcW w:type="dxa" w:w="5040"/>
-          </w:tcPr>
-          <w:p>
-            <w:r>
-              <w:rPr>
-                <w:b/>
-              </w:rPr>
-              <w:t>Merchant &amp; Utility Reminders</w:t>
-            </w:r>
-          </w:p>
-        </w:tc>
-        <w:tc>
-          <w:tcPr>
-            <w:tcW w:type="dxa" w:w="5040"/>
-          </w:tcPr>
-          <w:p>
-            <w:r>
-              <w:t>Nudges users for pending bills, recharge expiry, and recurring payments to build habit loops.</w:t>
-            </w:r>
-          </w:p>
-        </w:tc>
-      </w:tr>
-      <w:tr>
-        <w:tc>
-          <w:tcPr>
-            <w:tcW w:type="dxa" w:w="5040"/>
-          </w:tcPr>
-          <w:p>
-            <w:r>
-              <w:rPr>
-                <w:b/>
-              </w:rPr>
-              <w:t>Minimal Payment UX</w:t>
-            </w:r>
-          </w:p>
-        </w:tc>
-        <w:tc>
-          <w:tcPr>
-            <w:tcW w:type="dxa" w:w="5040"/>
-          </w:tcPr>
-          <w:p>
-            <w:r>
-              <w:t>Fast app launch, lightweight flow, and low clutter make GPay a preferred daily UPI app for frequent users.</w:t>
-            </w:r>
-          </w:p>
-        </w:tc>
-      </w:tr>
-      <w:tr>
-        <w:tc>
-          <w:tcPr>
-            <w:tcW w:type="dxa" w:w="5040"/>
-          </w:tcPr>
-          <w:p>
-            <w:r>
-              <w:rPr>
-                <w:b/>
-              </w:rPr>
-              <w:t>Conversation-style Payments</w:t>
-            </w:r>
-          </w:p>
-        </w:tc>
-        <w:tc>
-          <w:tcPr>
-            <w:tcW w:type="dxa" w:w="5040"/>
-          </w:tcPr>
-          <w:p>
-            <w:r>
-              <w:t>Contact-first UI increases recurring payments to friends and family.</w:t>
-            </w:r>
-          </w:p>
-        </w:tc>
-      </w:tr>
-      <w:tr>
-        <w:tc>
-          <w:tcPr>
-            <w:tcW w:type="dxa" w:w="5040"/>
-          </w:tcPr>
-          <w:p>
-            <w:r>
-              <w:rPr>
-                <w:b/>
-              </w:rPr>
-              <w:t>Seasonal Reward Campaigns</w:t>
-            </w:r>
-          </w:p>
-        </w:tc>
-        <w:tc>
-          <w:tcPr>
-            <w:tcW w:type="dxa" w:w="5040"/>
-          </w:tcPr>
-          <w:p>
-            <w:r>
-              <w:t>Limited-time festive games, cashback events, and streaks create temporary spikes in transaction frequency.</w:t>
-            </w:r>
-          </w:p>
-        </w:tc>
-      </w:tr>
-    </w:tbl>
-    <w:p>
-      <w:r>
-        <w:rPr>
-          <w:b w:val="0"/>
-          <w:i/>
-        </w:rPr>
-        <w:t>Key takeaway: Incumbents win with QR density , utility anchors , and layered engagement — not a single reward mechanic.</w:t>
-      </w:r>
-    </w:p>
-    <w:p>
-      <w:r>
-        <w:br w:type="page"/>
-      </w:r>
-    </w:p>
-    <w:p>
-      <w:pPr>
-        <w:pStyle w:val="Heading1"/>
-      </w:pPr>
-      <w:r>
-        <w:t>Slide 31</w:t>
-      </w:r>
-    </w:p>
-    <w:p>
-      <w:pPr>
-        <w:pStyle w:val="Heading2"/>
-      </w:pPr>
-      <w:r>
-        <w:t>Competitor insights — new-age players</w:t>
-      </w:r>
-    </w:p>
-    <w:p>
-      <w:r>
-        <w:rPr>
-          <w:b w:val="0"/>
-          <w:i w:val="0"/>
-        </w:rPr>
-        <w:t>CRED · Navi · Super.money — same colour key for highlighted unique strategies</w:t>
-      </w:r>
-    </w:p>
-    <w:tbl>
-      <w:tblPr>
-        <w:tblStyle w:val="TableGrid"/>
-        <w:tblW w:type="auto" w:w="0"/>
-        <w:tblLook w:firstColumn="1" w:firstRow="1" w:lastColumn="0" w:lastRow="0" w:noHBand="0" w:noVBand="1" w:val="04A0"/>
-      </w:tblPr>
-      <w:tblGrid>
-        <w:gridCol w:w="5040"/>
-        <w:gridCol w:w="5040"/>
-      </w:tblGrid>
-      <w:tr>
-        <w:tc>
-          <w:tcPr>
-            <w:tcW w:type="dxa" w:w="5040"/>
-          </w:tcPr>
-          <w:p>
-            <w:r>
-              <w:rPr>
-                <w:b/>
-              </w:rPr>
-              <w:t>Cashback for First 5 UPI Payments</w:t>
-            </w:r>
-          </w:p>
-        </w:tc>
-        <w:tc>
-          <w:tcPr>
-            <w:tcW w:type="dxa" w:w="5040"/>
-          </w:tcPr>
-          <w:p>
-            <w:r>
-              <w:t>Aggressive onboarding rewards to convert first-time users into habitual UPI users and then shifting gradually to third-party perks beyond cashback — e.g. free Uber One, Lenskart Gold, and other partner subscriptions/vouchers.</w:t>
-            </w:r>
-          </w:p>
-        </w:tc>
-      </w:tr>
-      <w:tr>
-        <w:tc>
-          <w:tcPr>
-            <w:tcW w:type="dxa" w:w="5040"/>
-          </w:tcPr>
-          <w:p>
-            <w:r>
-              <w:rPr>
-                <w:b/>
-              </w:rPr>
-              <w:t>Cashback Locked into Utility/Bill Payments</w:t>
-            </w:r>
-          </w:p>
-        </w:tc>
-        <w:tc>
-          <w:tcPr>
-            <w:tcW w:type="dxa" w:w="5040"/>
-          </w:tcPr>
-          <w:p>
-            <w:r>
-              <w:t>Cashback earned from UPI payments is redeemable primarily against utility bills, recharge, or bill payments — creating a cyclical payment loop and increasing repeat UPI frequency.</w:t>
-            </w:r>
-          </w:p>
-        </w:tc>
-      </w:tr>
-      <w:tr>
-        <w:tc>
-          <w:tcPr>
-            <w:tcW w:type="dxa" w:w="5040"/>
-          </w:tcPr>
-          <w:p>
-            <w:r>
-              <w:rPr>
-                <w:b/>
-              </w:rPr>
-              <w:t>Multi-bank link via SMS read</w:t>
-            </w:r>
-          </w:p>
-        </w:tc>
-        <w:tc>
-          <w:tcPr>
-            <w:tcW w:type="dxa" w:w="5040"/>
-          </w:tcPr>
-          <w:p>
-            <w:r>
-              <w:t>Promotes adding multiple bank accounts by reading SMS / account signals — deeper rail attachment and higher payment success options.</w:t>
-            </w:r>
-          </w:p>
-        </w:tc>
-      </w:tr>
-      <w:tr>
-        <w:tc>
-          <w:tcPr>
-            <w:tcW w:type="dxa" w:w="5040"/>
-          </w:tcPr>
-          <w:p>
-            <w:r>
-              <w:rPr>
-                <w:b/>
-              </w:rPr>
-              <w:t>Weekly Reward Events</w:t>
-            </w:r>
-          </w:p>
-        </w:tc>
-        <w:tc>
-          <w:tcPr>
-            <w:tcW w:type="dxa" w:w="5040"/>
-          </w:tcPr>
-          <w:p>
-            <w:r>
-              <w:t>Event-based cashback and limited reward windows create recurring user return cycles.</w:t>
-            </w:r>
-          </w:p>
-        </w:tc>
-      </w:tr>
-      <w:tr>
-        <w:tc>
-          <w:tcPr>
-            <w:tcW w:type="dxa" w:w="5040"/>
-          </w:tcPr>
-          <w:p>
-            <w:r>
-              <w:rPr>
-                <w:b/>
-              </w:rPr>
-              <w:t>Scan &amp; Pay Widget Usage</w:t>
-            </w:r>
-          </w:p>
-        </w:tc>
-        <w:tc>
-          <w:tcPr>
-            <w:tcW w:type="dxa" w:w="5040"/>
-          </w:tcPr>
-          <w:p>
-            <w:r>
-              <w:t>Heavy promotion of quick-access widgets for faster QR scanning and repeat merchant payments.</w:t>
-            </w:r>
-          </w:p>
-        </w:tc>
-      </w:tr>
-      <w:tr>
-        <w:tc>
-          <w:tcPr>
-            <w:tcW w:type="dxa" w:w="5040"/>
-          </w:tcPr>
-          <w:p>
-            <w:r>
-              <w:rPr>
-                <w:b/>
-              </w:rPr>
-              <w:t>Dead-user win-back</w:t>
-            </w:r>
-          </w:p>
-        </w:tc>
-        <w:tc>
-          <w:tcPr>
-            <w:tcW w:type="dxa" w:w="5040"/>
-          </w:tcPr>
-          <w:p>
-            <w:r>
-              <w:t>Cashback campaigns for users who have gone inactive — pushes dormant payers back into UPI with targeted “come back” offers.</w:t>
-            </w:r>
-          </w:p>
-        </w:tc>
-      </w:tr>
-      <w:tr>
-        <w:tc>
-          <w:tcPr>
-            <w:tcW w:type="dxa" w:w="5040"/>
-          </w:tcPr>
-          <w:p>
-            <w:r>
-              <w:rPr>
-                <w:b/>
-              </w:rPr>
-              <w:t>Quick-commerce dead-user win-back</w:t>
-            </w:r>
-          </w:p>
-        </w:tc>
-        <w:tc>
-          <w:tcPr>
-            <w:tcW w:type="dxa" w:w="5040"/>
-          </w:tcPr>
-          <w:p>
-            <w:r>
-              <w:t>Integrates with quick-commerce apps (Blinkit, Zepto, etc.) for dead user retention via cashback offers.</w:t>
+              <w:t>Exclusive cashback rewards for linking RuPay Credit Cards and doing transactions via RuPay Credit Card.</w:t>
             </w:r>
           </w:p>
         </w:tc>
@@ -13112,7 +12666,7 @@
               <w:rPr>
                 <w:b/>
               </w:rPr>
-              <w:t>Navi Coins → Real Cash</w:t>
+              <w:t>Task-based Gamification</w:t>
             </w:r>
           </w:p>
         </w:tc>
@@ -13122,7 +12676,7 @@
           </w:tcPr>
           <w:p>
             <w:r>
-              <w:t>Coins earned on UPI payments can be transparently converted into actual cash value.</w:t>
+              <w:t>“Pay a friend,” “scan a QR,” “do a recharge,” or streak-based missions encourage broader UPI rail usage.</w:t>
             </w:r>
           </w:p>
         </w:tc>
@@ -13137,7 +12691,7 @@
               <w:rPr>
                 <w:b/>
               </w:rPr>
-              <w:t>Direct Bank Transfer of Rewards</w:t>
+              <w:t>Micro Social Nudges</w:t>
             </w:r>
           </w:p>
         </w:tc>
@@ -13147,7 +12701,7 @@
           </w:tcPr>
           <w:p>
             <w:r>
-              <w:t>Users can transfer converted Navi Coins directly into their linked bank account, increasing perceived reward trust and utility.</w:t>
+              <w:t>₹1 gifting prompts, birthday reminders, and lightweight social payment interactions increase P2P frequency.</w:t>
             </w:r>
           </w:p>
         </w:tc>
@@ -13162,7 +12716,7 @@
               <w:rPr>
                 <w:b/>
               </w:rPr>
-              <w:t>Instant Reward Visibility</w:t>
+              <w:t>Scratch Cards</w:t>
             </w:r>
           </w:p>
         </w:tc>
@@ -13172,7 +12726,7 @@
           </w:tcPr>
           <w:p>
             <w:r>
-              <w:t>Cashback/reward reflected immediately after transaction completion strengthens reinforcement loop.</w:t>
+              <w:t>Surprise rewards after transactions maintain engagement despite smaller cashback values.</w:t>
             </w:r>
           </w:p>
         </w:tc>
@@ -13187,7 +12741,7 @@
               <w:rPr>
                 <w:b/>
               </w:rPr>
-              <w:t>Simple Payment-first UX</w:t>
+              <w:t>Time-bound Recharge Offers</w:t>
             </w:r>
           </w:p>
         </w:tc>
@@ -13197,7 +12751,7 @@
           </w:tcPr>
           <w:p>
             <w:r>
-              <w:t>Reduced clutter and fewer distractions keep focus on quick repeat UPI transactions.</w:t>
+              <w:t>Example: “Get ₹10 cashback on recharge above ₹200 within next 7 days.” Time-limited urgency drives repeat recharges and short-term retention.</w:t>
             </w:r>
           </w:p>
         </w:tc>
@@ -13212,7 +12766,7 @@
               <w:rPr>
                 <w:b/>
               </w:rPr>
-              <w:t>Fast Transaction Experience</w:t>
+              <w:t>Merchant &amp; Utility Reminders</w:t>
             </w:r>
           </w:p>
         </w:tc>
@@ -13222,7 +12776,7 @@
           </w:tcPr>
           <w:p>
             <w:r>
-              <w:t>Optimized payment flow and low latency improve repeat usage probability.</w:t>
+              <w:t>Nudges users for pending bills, recharge expiry, and recurring payments to build habit loops.</w:t>
             </w:r>
           </w:p>
         </w:tc>
@@ -13237,7 +12791,7 @@
               <w:rPr>
                 <w:b/>
               </w:rPr>
-              <w:t>Instant App Icon Prompt</w:t>
+              <w:t>Minimal Payment UX</w:t>
             </w:r>
           </w:p>
         </w:tc>
@@ -13247,7 +12801,7 @@
           </w:tcPr>
           <w:p>
             <w:r>
-              <w:t>Immediately after UPI ID creation, users are nudged to place Navi app icon/shortcut on the home screen to improve recall and daily usage frequency.</w:t>
+              <w:t>Fast app launch, lightweight flow, and low clutter make GPay a preferred daily UPI app for frequent users.</w:t>
             </w:r>
           </w:p>
         </w:tc>
@@ -13262,7 +12816,7 @@
               <w:rPr>
                 <w:b/>
               </w:rPr>
-              <w:t>Lightweight App Positioning</w:t>
+              <w:t>Conversation-style Payments</w:t>
             </w:r>
           </w:p>
         </w:tc>
@@ -13272,7 +12826,7 @@
           </w:tcPr>
           <w:p>
             <w:r>
-              <w:t>Users perceive Navi as faster and lighter compared to clutter-heavy competitors.</w:t>
+              <w:t>Contact-first UI increases recurring payments to friends and family.</w:t>
             </w:r>
           </w:p>
         </w:tc>
@@ -13287,7 +12841,7 @@
               <w:rPr>
                 <w:b/>
               </w:rPr>
-              <w:t>UPI Lite Promotion</w:t>
+              <w:t>Seasonal Reward Campaigns</w:t>
             </w:r>
           </w:p>
         </w:tc>
@@ -13297,7 +12851,207 @@
           </w:tcPr>
           <w:p>
             <w:r>
-              <w:t>Push to enable UPI Lite for tap-and-go low-value payments — faster repeat merchant &amp; P2P flows on weak networks.</w:t>
+              <w:t>Limited-time festive games, cashback events, and streaks create temporary spikes in transaction frequency.</w:t>
+            </w:r>
+          </w:p>
+        </w:tc>
+      </w:tr>
+    </w:tbl>
+    <w:p>
+      <w:r>
+        <w:rPr>
+          <w:b w:val="0"/>
+          <w:i/>
+        </w:rPr>
+        <w:t>Key takeaway: Incumbents win with QR density , utility anchors , and layered engagement — not a single reward mechanic.</w:t>
+      </w:r>
+    </w:p>
+    <w:p>
+      <w:r>
+        <w:br w:type="page"/>
+      </w:r>
+    </w:p>
+    <w:p>
+      <w:pPr>
+        <w:pStyle w:val="Heading1"/>
+      </w:pPr>
+      <w:r>
+        <w:t>Slide 33</w:t>
+      </w:r>
+    </w:p>
+    <w:p>
+      <w:pPr>
+        <w:pStyle w:val="Heading2"/>
+      </w:pPr>
+      <w:r>
+        <w:t>Competitor insights — new-age players</w:t>
+      </w:r>
+    </w:p>
+    <w:p>
+      <w:r>
+        <w:rPr>
+          <w:b w:val="0"/>
+          <w:i w:val="0"/>
+        </w:rPr>
+        <w:t>CRED · Navi · Super.money — same colour key for highlighted unique strategies</w:t>
+      </w:r>
+    </w:p>
+    <w:tbl>
+      <w:tblPr>
+        <w:tblStyle w:val="TableGrid"/>
+        <w:tblW w:type="auto" w:w="0"/>
+        <w:tblLook w:firstColumn="1" w:firstRow="1" w:lastColumn="0" w:lastRow="0" w:noHBand="0" w:noVBand="1" w:val="04A0"/>
+      </w:tblPr>
+      <w:tblGrid>
+        <w:gridCol w:w="5040"/>
+        <w:gridCol w:w="5040"/>
+      </w:tblGrid>
+      <w:tr>
+        <w:tc>
+          <w:tcPr>
+            <w:tcW w:type="dxa" w:w="5040"/>
+          </w:tcPr>
+          <w:p>
+            <w:r>
+              <w:rPr>
+                <w:b/>
+              </w:rPr>
+              <w:t>Cashback for First 5 UPI Payments</w:t>
+            </w:r>
+          </w:p>
+        </w:tc>
+        <w:tc>
+          <w:tcPr>
+            <w:tcW w:type="dxa" w:w="5040"/>
+          </w:tcPr>
+          <w:p>
+            <w:r>
+              <w:t>Aggressive onboarding rewards to convert first-time users into habitual UPI users and then shifting gradually to third-party perks beyond cashback — e.g. free Uber One, Lenskart Gold, and other partner subscriptions/vouchers.</w:t>
+            </w:r>
+          </w:p>
+        </w:tc>
+      </w:tr>
+      <w:tr>
+        <w:tc>
+          <w:tcPr>
+            <w:tcW w:type="dxa" w:w="5040"/>
+          </w:tcPr>
+          <w:p>
+            <w:r>
+              <w:rPr>
+                <w:b/>
+              </w:rPr>
+              <w:t>Cashback Locked into Utility/Bill Payments</w:t>
+            </w:r>
+          </w:p>
+        </w:tc>
+        <w:tc>
+          <w:tcPr>
+            <w:tcW w:type="dxa" w:w="5040"/>
+          </w:tcPr>
+          <w:p>
+            <w:r>
+              <w:t>Cashback earned from UPI payments is redeemable primarily against utility bills, recharge, or bill payments — creating a cyclical payment loop and increasing repeat UPI frequency.</w:t>
+            </w:r>
+          </w:p>
+        </w:tc>
+      </w:tr>
+      <w:tr>
+        <w:tc>
+          <w:tcPr>
+            <w:tcW w:type="dxa" w:w="5040"/>
+          </w:tcPr>
+          <w:p>
+            <w:r>
+              <w:rPr>
+                <w:b/>
+              </w:rPr>
+              <w:t>Multi-bank link via SMS read</w:t>
+            </w:r>
+          </w:p>
+        </w:tc>
+        <w:tc>
+          <w:tcPr>
+            <w:tcW w:type="dxa" w:w="5040"/>
+          </w:tcPr>
+          <w:p>
+            <w:r>
+              <w:t>Promotes adding multiple bank accounts by reading SMS / account signals — deeper rail attachment and higher payment success options.</w:t>
+            </w:r>
+          </w:p>
+        </w:tc>
+      </w:tr>
+      <w:tr>
+        <w:tc>
+          <w:tcPr>
+            <w:tcW w:type="dxa" w:w="5040"/>
+          </w:tcPr>
+          <w:p>
+            <w:r>
+              <w:rPr>
+                <w:b/>
+              </w:rPr>
+              <w:t>Weekly Reward Events</w:t>
+            </w:r>
+          </w:p>
+        </w:tc>
+        <w:tc>
+          <w:tcPr>
+            <w:tcW w:type="dxa" w:w="5040"/>
+          </w:tcPr>
+          <w:p>
+            <w:r>
+              <w:t>Event-based cashback and limited reward windows create recurring user return cycles.</w:t>
+            </w:r>
+          </w:p>
+        </w:tc>
+      </w:tr>
+      <w:tr>
+        <w:tc>
+          <w:tcPr>
+            <w:tcW w:type="dxa" w:w="5040"/>
+          </w:tcPr>
+          <w:p>
+            <w:r>
+              <w:rPr>
+                <w:b/>
+              </w:rPr>
+              <w:t>Scan &amp; Pay Widget Usage</w:t>
+            </w:r>
+          </w:p>
+        </w:tc>
+        <w:tc>
+          <w:tcPr>
+            <w:tcW w:type="dxa" w:w="5040"/>
+          </w:tcPr>
+          <w:p>
+            <w:r>
+              <w:t>Heavy promotion of quick-access widgets for faster QR scanning and repeat merchant payments.</w:t>
+            </w:r>
+          </w:p>
+        </w:tc>
+      </w:tr>
+      <w:tr>
+        <w:tc>
+          <w:tcPr>
+            <w:tcW w:type="dxa" w:w="5040"/>
+          </w:tcPr>
+          <w:p>
+            <w:r>
+              <w:rPr>
+                <w:b/>
+              </w:rPr>
+              <w:t>Dead-user win-back</w:t>
+            </w:r>
+          </w:p>
+        </w:tc>
+        <w:tc>
+          <w:tcPr>
+            <w:tcW w:type="dxa" w:w="5040"/>
+          </w:tcPr>
+          <w:p>
+            <w:r>
+              <w:t>Cashback campaigns for users who have gone inactive — pushes dormant payers back into UPI with targeted “come back” offers.</w:t>
             </w:r>
           </w:p>
         </w:tc>
@@ -13348,6 +13102,242 @@
               <w:rPr>
                 <w:b/>
               </w:rPr>
+              <w:t>Navi Coins → Real Cash</w:t>
+            </w:r>
+          </w:p>
+        </w:tc>
+        <w:tc>
+          <w:tcPr>
+            <w:tcW w:type="dxa" w:w="5040"/>
+          </w:tcPr>
+          <w:p>
+            <w:r>
+              <w:t>Coins earned on UPI payments can be transparently converted into actual cash value.</w:t>
+            </w:r>
+          </w:p>
+        </w:tc>
+      </w:tr>
+      <w:tr>
+        <w:tc>
+          <w:tcPr>
+            <w:tcW w:type="dxa" w:w="5040"/>
+          </w:tcPr>
+          <w:p>
+            <w:r>
+              <w:rPr>
+                <w:b/>
+              </w:rPr>
+              <w:t>Direct Bank Transfer of Rewards</w:t>
+            </w:r>
+          </w:p>
+        </w:tc>
+        <w:tc>
+          <w:tcPr>
+            <w:tcW w:type="dxa" w:w="5040"/>
+          </w:tcPr>
+          <w:p>
+            <w:r>
+              <w:t>Users can transfer converted Navi Coins directly into their linked bank account, increasing perceived reward trust and utility.</w:t>
+            </w:r>
+          </w:p>
+        </w:tc>
+      </w:tr>
+      <w:tr>
+        <w:tc>
+          <w:tcPr>
+            <w:tcW w:type="dxa" w:w="5040"/>
+          </w:tcPr>
+          <w:p>
+            <w:r>
+              <w:rPr>
+                <w:b/>
+              </w:rPr>
+              <w:t>Instant Reward Visibility</w:t>
+            </w:r>
+          </w:p>
+        </w:tc>
+        <w:tc>
+          <w:tcPr>
+            <w:tcW w:type="dxa" w:w="5040"/>
+          </w:tcPr>
+          <w:p>
+            <w:r>
+              <w:t>Cashback/reward reflected immediately after transaction completion strengthens reinforcement loop.</w:t>
+            </w:r>
+          </w:p>
+        </w:tc>
+      </w:tr>
+      <w:tr>
+        <w:tc>
+          <w:tcPr>
+            <w:tcW w:type="dxa" w:w="5040"/>
+          </w:tcPr>
+          <w:p>
+            <w:r>
+              <w:rPr>
+                <w:b/>
+              </w:rPr>
+              <w:t>Simple Payment-first UX</w:t>
+            </w:r>
+          </w:p>
+        </w:tc>
+        <w:tc>
+          <w:tcPr>
+            <w:tcW w:type="dxa" w:w="5040"/>
+          </w:tcPr>
+          <w:p>
+            <w:r>
+              <w:t>Reduced clutter and fewer distractions keep focus on quick repeat UPI transactions.</w:t>
+            </w:r>
+          </w:p>
+        </w:tc>
+      </w:tr>
+      <w:tr>
+        <w:tc>
+          <w:tcPr>
+            <w:tcW w:type="dxa" w:w="5040"/>
+          </w:tcPr>
+          <w:p>
+            <w:r>
+              <w:rPr>
+                <w:b/>
+              </w:rPr>
+              <w:t>Fast Transaction Experience</w:t>
+            </w:r>
+          </w:p>
+        </w:tc>
+        <w:tc>
+          <w:tcPr>
+            <w:tcW w:type="dxa" w:w="5040"/>
+          </w:tcPr>
+          <w:p>
+            <w:r>
+              <w:t>Optimized payment flow and low latency improve repeat usage probability.</w:t>
+            </w:r>
+          </w:p>
+        </w:tc>
+      </w:tr>
+      <w:tr>
+        <w:tc>
+          <w:tcPr>
+            <w:tcW w:type="dxa" w:w="5040"/>
+          </w:tcPr>
+          <w:p>
+            <w:r>
+              <w:rPr>
+                <w:b/>
+              </w:rPr>
+              <w:t>Instant App Icon Prompt</w:t>
+            </w:r>
+          </w:p>
+        </w:tc>
+        <w:tc>
+          <w:tcPr>
+            <w:tcW w:type="dxa" w:w="5040"/>
+          </w:tcPr>
+          <w:p>
+            <w:r>
+              <w:t>Immediately after UPI ID creation, users are nudged to place Navi app icon/shortcut on the home screen to improve recall and daily usage frequency.</w:t>
+            </w:r>
+          </w:p>
+        </w:tc>
+      </w:tr>
+      <w:tr>
+        <w:tc>
+          <w:tcPr>
+            <w:tcW w:type="dxa" w:w="5040"/>
+          </w:tcPr>
+          <w:p>
+            <w:r>
+              <w:rPr>
+                <w:b/>
+              </w:rPr>
+              <w:t>Lightweight App Positioning</w:t>
+            </w:r>
+          </w:p>
+        </w:tc>
+        <w:tc>
+          <w:tcPr>
+            <w:tcW w:type="dxa" w:w="5040"/>
+          </w:tcPr>
+          <w:p>
+            <w:r>
+              <w:t>Users perceive Navi as faster and lighter compared to clutter-heavy competitors.</w:t>
+            </w:r>
+          </w:p>
+        </w:tc>
+      </w:tr>
+      <w:tr>
+        <w:tc>
+          <w:tcPr>
+            <w:tcW w:type="dxa" w:w="5040"/>
+          </w:tcPr>
+          <w:p>
+            <w:r>
+              <w:rPr>
+                <w:b/>
+              </w:rPr>
+              <w:t>UPI Lite Promotion</w:t>
+            </w:r>
+          </w:p>
+        </w:tc>
+        <w:tc>
+          <w:tcPr>
+            <w:tcW w:type="dxa" w:w="5040"/>
+          </w:tcPr>
+          <w:p>
+            <w:r>
+              <w:t>Push to enable UPI Lite for tap-and-go low-value payments — faster repeat merchant &amp; P2P flows on weak networks.</w:t>
+            </w:r>
+          </w:p>
+        </w:tc>
+      </w:tr>
+      <w:tr>
+        <w:tc>
+          <w:tcPr>
+            <w:tcW w:type="dxa" w:w="5040"/>
+          </w:tcPr>
+          <w:p>
+            <w:r>
+              <w:rPr>
+                <w:b/>
+              </w:rPr>
+              <w:t>Quick-commerce dead-user win-back</w:t>
+            </w:r>
+          </w:p>
+        </w:tc>
+        <w:tc>
+          <w:tcPr>
+            <w:tcW w:type="dxa" w:w="5040"/>
+          </w:tcPr>
+          <w:p>
+            <w:r>
+              <w:t>Integrates with quick-commerce apps (Blinkit, Zepto, etc.) for dead user retention via cashback offers.</w:t>
+            </w:r>
+          </w:p>
+        </w:tc>
+      </w:tr>
+    </w:tbl>
+    <w:tbl>
+      <w:tblPr>
+        <w:tblStyle w:val="TableGrid"/>
+        <w:tblW w:type="auto" w:w="0"/>
+        <w:tblLook w:firstColumn="1" w:firstRow="1" w:lastColumn="0" w:lastRow="0" w:noHBand="0" w:noVBand="1" w:val="04A0"/>
+      </w:tblPr>
+      <w:tblGrid>
+        <w:gridCol w:w="5040"/>
+        <w:gridCol w:w="5040"/>
+      </w:tblGrid>
+      <w:tr>
+        <w:tc>
+          <w:tcPr>
+            <w:tcW w:type="dxa" w:w="5040"/>
+          </w:tcPr>
+          <w:p>
+            <w:r>
+              <w:rPr>
+                <w:b/>
+              </w:rPr>
               <w:t>Real Cashback in Bank</w:t>
             </w:r>
           </w:p>
@@ -13576,15 +13566,7 @@
         <w:pStyle w:val="Heading1"/>
       </w:pPr>
       <w:r>
-        <w:t>Slide 32</w:t>
-      </w:r>
-    </w:p>
-    <w:p>
-      <w:pPr>
-        <w:pStyle w:val="Heading2"/>
-      </w:pPr>
-      <w:r>
-        <w:t>Emerging Patterns - Community Sentiments from 50k+ conversation (POST, COMMENT) on reddit, linkedin and X</w:t>
+        <w:t>Slide 34</w:t>
       </w:r>
     </w:p>
     <w:p>
@@ -13593,7 +13575,99 @@
           <w:b w:val="0"/>
           <w:i w:val="0"/>
         </w:rPr>
-        <w:t>Six patterns from competitor deep-dive (slides 30–31) · Reddit proof below</w:t>
+        <w:t>Chapter VI · Community</w:t>
+      </w:r>
+    </w:p>
+    <w:p>
+      <w:r>
+        <w:rPr>
+          <w:b w:val="0"/>
+          <w:i w:val="0"/>
+        </w:rPr>
+        <w:t>Community decoded</w:t>
+      </w:r>
+    </w:p>
+    <w:p>
+      <w:pPr>
+        <w:pStyle w:val="Heading2"/>
+      </w:pPr>
+      <w:r>
+        <w:t>Community Signals &amp; Emerging Patterns</w:t>
+      </w:r>
+    </w:p>
+    <w:p>
+      <w:r>
+        <w:rPr>
+          <w:b w:val="0"/>
+          <w:i w:val="0"/>
+        </w:rPr>
+        <w:t>50K+ Reddit · X · LinkedIn discussions decoded — six patterns from competitor deep-dive</w:t>
+      </w:r>
+    </w:p>
+    <w:p>
+      <w:r>
+        <w:rPr>
+          <w:b w:val="0"/>
+          <w:i w:val="0"/>
+        </w:rPr>
+        <w:t>Six pattern cards</w:t>
+      </w:r>
+    </w:p>
+    <w:p>
+      <w:r>
+        <w:rPr>
+          <w:b w:val="0"/>
+          <w:i w:val="0"/>
+        </w:rPr>
+        <w:t>Reddit proof</w:t>
+      </w:r>
+    </w:p>
+    <w:p>
+      <w:r>
+        <w:rPr>
+          <w:b w:val="0"/>
+          <w:i w:val="0"/>
+        </w:rPr>
+        <w:t>Press →</w:t>
+      </w:r>
+    </w:p>
+    <w:p>
+      <w:r>
+        <w:rPr>
+          <w:b w:val="0"/>
+          <w:i/>
+        </w:rPr>
+        <w:t>Key takeaway: Voice of the market — six patterns plus live community proof.</w:t>
+      </w:r>
+    </w:p>
+    <w:p>
+      <w:r>
+        <w:br w:type="page"/>
+      </w:r>
+    </w:p>
+    <w:p>
+      <w:pPr>
+        <w:pStyle w:val="Heading1"/>
+      </w:pPr>
+      <w:r>
+        <w:t>Slide 35</w:t>
+      </w:r>
+    </w:p>
+    <w:p>
+      <w:pPr>
+        <w:pStyle w:val="Heading2"/>
+      </w:pPr>
+      <w:r>
+        <w:t>Emerging Patterns - Community Sentiments from 50k+ conversation (POST, COMMENT) on reddit, linkedin and X</w:t>
+      </w:r>
+    </w:p>
+    <w:p>
+      <w:r>
+        <w:rPr>
+          <w:b w:val="0"/>
+          <w:i w:val="0"/>
+        </w:rPr>
+        <w:t>Six patterns from competitor deep-dive (slides 32–33) · Reddit proof below</w:t>
       </w:r>
     </w:p>
     <w:p>
@@ -13929,7 +14003,7 @@
         <w:pStyle w:val="Heading1"/>
       </w:pPr>
       <w:r>
-        <w:t>Slide 33</w:t>
+        <w:t>Slide 36</w:t>
       </w:r>
     </w:p>
     <w:p>
@@ -13938,7 +14012,7 @@
           <w:b w:val="0"/>
           <w:i w:val="0"/>
         </w:rPr>
-        <w:t>Chapter IV · Land the plane</w:t>
+        <w:t>Chapter VII · Close</w:t>
       </w:r>
     </w:p>
     <w:p>
@@ -13946,7 +14020,7 @@
         <w:pStyle w:val="Heading2"/>
       </w:pPr>
       <w:r>
-        <w:t>From patterns to priorities</w:t>
+        <w:t>What Must Change</w:t>
       </w:r>
     </w:p>
     <w:p>
@@ -13955,7 +14029,7 @@
           <w:b w:val="0"/>
           <w:i w:val="0"/>
         </w:rPr>
-        <w:t>Six emerging patterns and Reddit sentiment are clear — next slide lists broad strategic priorities (what, not how) from our data, Play Store voice, and competition.</w:t>
+        <w:t>Key retention levers &amp; opportunities — what, not how</w:t>
       </w:r>
     </w:p>
     <w:p>
@@ -13964,7 +14038,7 @@
           <w:b w:val="0"/>
           <w:i/>
         </w:rPr>
-        <w:t>Key takeaway: Benchmarking is done — next: what BharatPe should prioritise , not implementation detail.</w:t>
+        <w:t>Key takeaway: Land with strategic priorities from data, reviews, BBPS, competition, and community.</w:t>
       </w:r>
     </w:p>
     <w:p>
@@ -13977,7 +14051,7 @@
         <w:pStyle w:val="Heading1"/>
       </w:pPr>
       <w:r>
-        <w:t>Slide 34</w:t>
+        <w:t>Slide 37</w:t>
       </w:r>
     </w:p>
     <w:p>
@@ -13994,7 +14068,7 @@
           <w:b w:val="0"/>
           <w:i w:val="0"/>
         </w:rPr>
-        <w:t>Broad strategic priorities only — what , not how · from warehouse lenses, Play Store (23–25), competition (30–31), community (32)</w:t>
+        <w:t>Broad strategic priorities only — what , not how · from warehouse lenses, Play Store (25–27), competition (32–33), community (35)</w:t>
       </w:r>
     </w:p>
     <w:p>
@@ -14096,7 +14170,7 @@
         <w:pStyle w:val="Heading3"/>
       </w:pPr>
       <w:r>
-        <w:t>Protect brand trust</w:t>
+        <w:t>Streaks, win-back, and category rewards</w:t>
       </w:r>
     </w:p>
     <w:p>
@@ -14105,7 +14179,7 @@
           <w:b w:val="0"/>
           <w:i w:val="0"/>
         </w:rPr>
-        <w:t>Address fraud/scam perception, unfulfilled rewards, and loan-recovery harassment themes that erode willingness to keep paying on BharatPe.</w:t>
+        <w:t>Use UPI payment streaks, dormant-user reactivation offers, and category-specific rewards (for example: 100 coins grant, redeem 20 coins across next 5 BBPS payments) to drive repeat habit.</w:t>
       </w:r>
     </w:p>
     <w:p>

</xml_diff>